<commit_message>
checkpoint cleaner model overview
</commit_message>
<xml_diff>
--- a/docs/index.docx
+++ b/docs/index.docx
@@ -159,13 +159,13 @@
         <w:t xml:space="preserve"> </w:t>
       </w:r>
       <w:r>
-        <w:t xml:space="preserve">When later retrieval contexts cue both film representations and task competitors, uncontrolled retrieval from context cues is less likely to sample trauma-film items in intrusion-like retrieval, even though film-item strength is not reduced.</w:t>
-      </w:r>
-      <w:r>
-        <w:t xml:space="preserve"> </w:t>
-      </w:r>
-      <w:r>
-        <w:t xml:space="preserve">Deliberate recall is less vulnerable when task goals and control processes reinstate film context and prioritize film items over competitors for retrieval; film-specific cues can also steer retrieval toward film context across test formats.</w:t>
+        <w:t xml:space="preserve">When later retrieval contexts cue both film items and task competitors, uncontrolled retrieval from context cues is less likely to sample trauma-film items in intrusion-like retrieval, even though film-item strength is not reduced.</w:t>
+      </w:r>
+      <w:r>
+        <w:t xml:space="preserve"> </w:t>
+      </w:r>
+      <w:r>
+        <w:t xml:space="preserve">Deliberate recall is less vulnerable when task goals and control processes reinstate film context and prioritize film items over competitors for retrieval; film-related cues can also steer retrieval toward film context across test formats.</w:t>
       </w:r>
       <w:r>
         <w:t xml:space="preserve"> </w:t>
@@ -1043,93 +1043,7 @@
         <w:pStyle w:val="BodyText"/>
       </w:pPr>
       <w:r>
-        <w:t xml:space="preserve">Consolidation and reconsolidation accounts locate selective interference in a change to the availability of the film representation after encoding or reminder reactivation.</w:t>
-      </w:r>
-      <w:r>
-        <w:t xml:space="preserve"> </w:t>
-      </w:r>
-      <w:r>
-        <w:t xml:space="preserve">The retrieved-context account developed here instead treats interference as a change in the competitive retrieval environment around the film.</w:t>
-      </w:r>
-      <w:r>
-        <w:t xml:space="preserve"> </w:t>
-      </w:r>
-      <w:r>
-        <w:t xml:space="preserve">Post-film or post-reminder activity can add competitors near the film in context, while deliberate recall can partially protect access by guiding retrieval toward the film.</w:t>
-      </w:r>
-      <w:r>
-        <w:t xml:space="preserve"> </w:t>
-      </w:r>
-      <w:r>
-        <w:t xml:space="preserve">On this view, the intrusion-voluntary-memory dissociation reflects different retrieval states applied to shared memory associations.</w:t>
-      </w:r>
-    </w:p>
-    <w:p>
-      <w:pPr>
-        <w:pStyle w:val="BodyText"/>
-      </w:pPr>
-      <w:r>
-        <w:t xml:space="preserve">Our simulations evaluate the account at the level where a retrieved-context model makes its distinctive predictions: the distribution and organization of recall across the film, interference, and delay phases of a trauma-film paradigm.</w:t>
-      </w:r>
-      <w:r>
-        <w:t xml:space="preserve"> </w:t>
-      </w:r>
-      <w:r>
-        <w:t xml:space="preserve">They first demonstrate the core selective-interference dissociation without separately vulnerable representations: an interference task can reduce intrusion-like retrieval more than deliberate recall, even though the same stored film episode supports both.</w:t>
-      </w:r>
-      <w:r>
-        <w:t xml:space="preserve"> </w:t>
-      </w:r>
-      <w:r>
-        <w:t xml:space="preserve">They then distinguish the control mechanisms that protect deliberate recall, showing how a more film-directed retrieval state and a sharper decision rule produce different patterns of impairment in both recall rates and recall organization.</w:t>
-      </w:r>
-      <w:r>
-        <w:t xml:space="preserve"> </w:t>
-      </w:r>
-      <w:r>
-        <w:t xml:space="preserve">The next simulations separate the contributions of competitor strength and contextual overlap, clarifying when an interference task becomes an effective competitor for film retrieval and how reminder-driven reinstatement can support delayed interference.</w:t>
-      </w:r>
-      <w:r>
-        <w:t xml:space="preserve"> </w:t>
-      </w:r>
-      <w:r>
-        <w:t xml:space="preserve">Follow-up simulations use the same framework to interpret heterogeneity across empirical paradigms.</w:t>
-      </w:r>
-      <w:r>
-        <w:t xml:space="preserve"> </w:t>
-      </w:r>
-      <w:r>
-        <w:t xml:space="preserve">They show that film-related cues during intrusion monitoring can narrow the intrusion-voluntary-memory dissociation by making intrusion-like retrieval less purely unguided.</w:t>
-      </w:r>
-      <w:r>
-        <w:t xml:space="preserve"> </w:t>
-      </w:r>
-      <w:r>
-        <w:t xml:space="preserve">They also show that item-specific or film-specific probes can make voluntary access less vulnerable to interference than tests that rely on broad context-to-item search, because broad search leaves film items competing more directly with task competitors.</w:t>
-      </w:r>
-      <w:r>
-        <w:t xml:space="preserve"> </w:t>
-      </w:r>
-      <w:r>
-        <w:t xml:space="preserve">The result is a mechanistic alternative to separately vulnerable memory representations and a set of specific hypotheses about when selective interference should appear and how it should vary across paradigms.</w:t>
-      </w:r>
-    </w:p>
-    <w:bookmarkEnd w:id="24"/>
-    <w:bookmarkStart w:id="25" w:name="Xc30ecb24643046c4752102619295de1bc2871c8"/>
-    <w:p>
-      <w:pPr>
-        <w:pStyle w:val="Heading1"/>
-      </w:pPr>
-      <w:r>
-        <w:t xml:space="preserve">A Retrieved-Context Account of Selective Interference</w:t>
-      </w:r>
-    </w:p>
-    <w:p>
-      <w:pPr>
-        <w:pStyle w:val="FirstParagraph"/>
-      </w:pPr>
-      <w:r>
-        <w:t xml:space="preserve">The account developed here builds on a contextual binding theory of episodic memory: experienced events are encoded by binding item representations to the current state of a continuously evolving context</w:t>
+        <w:t xml:space="preserve">For selective interference, our model treats the film, any reminder, and subsequent interference as episodes encoded by binding item representations to a continuously evolving context representation</w:t>
       </w:r>
       <w:r>
         <w:t xml:space="preserve"> </w:t>
@@ -1151,6 +1065,20 @@
       <w:r>
         <w:t xml:space="preserve"> </w:t>
       </w:r>
+      <w:hyperlink w:anchor="ref-polyn2009context">
+        <w:r>
+          <w:rPr>
+            <w:rStyle w:val="Hyperlink"/>
+          </w:rPr>
+          <w:t xml:space="preserve">Polyn et al., 2009</w:t>
+        </w:r>
+      </w:hyperlink>
+      <w:r>
+        <w:t xml:space="preserve">;</w:t>
+      </w:r>
+      <w:r>
+        <w:t xml:space="preserve"> </w:t>
+      </w:r>
       <w:hyperlink w:anchor="ref-yonelinas2019contextual">
         <w:r>
           <w:rPr>
@@ -1169,67 +1097,260 @@
         <w:t xml:space="preserve"> </w:t>
       </w:r>
       <w:r>
-        <w:t xml:space="preserve">Context encompasses temporal, source, and other features that can change at different rates across experience</w:t>
-      </w:r>
-      <w:r>
-        <w:t xml:space="preserve"> </w:t>
-      </w:r>
-      <w:r>
-        <w:t xml:space="preserve">(</w:t>
-      </w:r>
-      <w:hyperlink w:anchor="ref-yonelinas2019contextual">
+        <w:t xml:space="preserve">Post-film or post-reminder activity can therefore encode task items in context states that overlap with film context, including states reinstated by reminders.</w:t>
+      </w:r>
+      <w:r>
+        <w:t xml:space="preserve"> </w:t>
+      </w:r>
+      <w:r>
+        <w:t xml:space="preserve">At retrieval, the current context state cues memory search, so competition depends on how strongly film and task episodes are associated with similar context states.</w:t>
+      </w:r>
+      <w:r>
+        <w:t xml:space="preserve"> </w:t>
+      </w:r>
+      <w:r>
+        <w:t xml:space="preserve">Deliberate recall can reduce this competition when retrieval begins from a more film-directed state and when selection favors film items over competitors.</w:t>
+      </w:r>
+      <w:r>
+        <w:t xml:space="preserve"> </w:t>
+      </w:r>
+      <w:r>
+        <w:t xml:space="preserve">The account therefore attributes the intrusion-voluntary-memory dissociation to different retrieval states applied to shared memory associations.</w:t>
+      </w:r>
+      <w:r>
+        <w:t xml:space="preserve"> </w:t>
+      </w:r>
+      <w:r>
+        <w:t xml:space="preserve">This reframes selective interference as a change in the competitive retrieval environment around the film, rather than as a change in the availability of the film representation after encoding or reminder reactivation.</w:t>
+      </w:r>
+    </w:p>
+    <w:p>
+      <w:pPr>
+        <w:pStyle w:val="BodyText"/>
+      </w:pPr>
+      <w:r>
+        <w:t xml:space="preserve">Our simulations evaluate the account at the level where a retrieved-context model makes its distinctive predictions: the distribution and organization of recall across the film, interference, and delay phases of a trauma-film paradigm.</w:t>
+      </w:r>
+      <w:r>
+        <w:t xml:space="preserve"> </w:t>
+      </w:r>
+      <w:r>
+        <w:t xml:space="preserve">They first demonstrate the core selective-interference dissociation without separately vulnerable representations: an interference task can reduce intrusion-like retrieval more than deliberate recall, even though the same stored film episode supports both.</w:t>
+      </w:r>
+      <w:r>
+        <w:t xml:space="preserve"> </w:t>
+      </w:r>
+      <w:r>
+        <w:t xml:space="preserve">They then distinguish the control mechanisms that protect deliberate recall, showing how a more film-directed retrieval state and a sharper decision rule produce different patterns of impairment in both recall rates and recall organization.</w:t>
+      </w:r>
+      <w:r>
+        <w:t xml:space="preserve"> </w:t>
+      </w:r>
+      <w:r>
+        <w:t xml:space="preserve">The next simulations separate the contributions of competitor strength and contextual overlap, clarifying when an interference task becomes an effective competitor for film retrieval and how reminder-driven reinstatement can support delayed interference.</w:t>
+      </w:r>
+      <w:r>
+        <w:t xml:space="preserve"> </w:t>
+      </w:r>
+      <w:r>
+        <w:t xml:space="preserve">Follow-up simulations use the same framework to interpret heterogeneity across empirical paradigms.</w:t>
+      </w:r>
+      <w:r>
+        <w:t xml:space="preserve"> </w:t>
+      </w:r>
+      <w:r>
+        <w:t xml:space="preserve">They show that film-related cues during intrusion monitoring can narrow the intrusion-voluntary-memory dissociation by making intrusion-like retrieval less purely unguided.</w:t>
+      </w:r>
+      <w:r>
+        <w:t xml:space="preserve"> </w:t>
+      </w:r>
+      <w:r>
+        <w:t xml:space="preserve">They also show that tests supplying a film item can be less vulnerable to interference, because the supplied item can reinstate its associated context instead of requiring retrieval to sample among film items and task competitors from a broad contextual cue.</w:t>
+      </w:r>
+      <w:r>
+        <w:t xml:space="preserve"> </w:t>
+      </w:r>
+      <w:r>
+        <w:t xml:space="preserve">The result is a mechanistic alternative to separately vulnerable memory representations and a set of specific hypotheses about when selective interference should appear and how it should vary across paradigms.</w:t>
+      </w:r>
+    </w:p>
+    <w:bookmarkEnd w:id="24"/>
+    <w:bookmarkStart w:id="26" w:name="Xc30ecb24643046c4752102619295de1bc2871c8"/>
+    <w:p>
+      <w:pPr>
+        <w:pStyle w:val="Heading1"/>
+      </w:pPr>
+      <w:r>
+        <w:t xml:space="preserve">A Retrieved-Context Account of Selective Interference</w:t>
+      </w:r>
+    </w:p>
+    <w:p>
+      <w:pPr>
+        <w:pStyle w:val="FirstParagraph"/>
+      </w:pPr>
+      <w:r>
+        <w:t xml:space="preserve">The simulations rely on three retrieved-context mechanisms.</w:t>
+      </w:r>
+      <w:r>
+        <w:t xml:space="preserve"> </w:t>
+      </w:r>
+      <w:r>
+        <w:t xml:space="preserve">Context-to-item retrieval uses current context to cue candidate items.</w:t>
+      </w:r>
+      <w:r>
+        <w:t xml:space="preserve"> </w:t>
+      </w:r>
+      <w:r>
+        <w:t xml:space="preserve">Competition follows when film items and task competitors are associated with similar context states.</w:t>
+      </w:r>
+      <w:r>
+        <w:t xml:space="preserve"> </w:t>
+      </w:r>
+      <w:r>
+        <w:t xml:space="preserve">Item-to-context retrieval allows recalled items, reminder cues, and supplied film items to reinstate associated context.</w:t>
+      </w:r>
+      <w:r>
+        <w:t xml:space="preserve"> </w:t>
+      </w:r>
+      <w:r>
+        <w:t xml:space="preserve">Film-directed retrieval control changes the starting cue and selection rule used to favor film items over task competitors.</w:t>
+      </w:r>
+      <w:r>
+        <w:t xml:space="preserve"> </w:t>
+      </w:r>
+      <w:hyperlink w:anchor="fig-retrieved-context-account">
         <w:r>
           <w:rPr>
             <w:rStyle w:val="Hyperlink"/>
           </w:rPr>
-          <w:t xml:space="preserve">Yonelinas et al., 2019</w:t>
+          <w:t xml:space="preserve">Figure 1</w:t>
         </w:r>
       </w:hyperlink>
       <w:r>
-        <w:t xml:space="preserve">)</w:t>
-      </w:r>
-      <w:r>
-        <w:t xml:space="preserve">.</w:t>
-      </w:r>
-      <w:r>
-        <w:t xml:space="preserve"> </w:t>
-      </w:r>
-      <w:r>
-        <w:t xml:space="preserve">Events encoded in similar context states compete during retrieval, so selective interference can arise when task events are encoded near film events in context</w:t>
-      </w:r>
-      <w:r>
-        <w:t xml:space="preserve"> </w:t>
-      </w:r>
-      <w:r>
-        <w:t xml:space="preserve">(</w:t>
-      </w:r>
-      <w:hyperlink w:anchor="ref-mensink1989model">
-        <w:r>
-          <w:rPr>
-            <w:rStyle w:val="Hyperlink"/>
-          </w:rPr>
-          <w:t xml:space="preserve">Mensink &amp; Raaijmakers, 1989</w:t>
-        </w:r>
-      </w:hyperlink>
-      <w:r>
-        <w:t xml:space="preserve">;</w:t>
-      </w:r>
-      <w:r>
-        <w:t xml:space="preserve"> </w:t>
-      </w:r>
-      <w:hyperlink w:anchor="ref-yonelinas2019contextual">
-        <w:r>
-          <w:rPr>
-            <w:rStyle w:val="Hyperlink"/>
-          </w:rPr>
-          <w:t xml:space="preserve">Yonelinas et al., 2019</w:t>
-        </w:r>
-      </w:hyperlink>
-      <w:r>
-        <w:t xml:space="preserve">)</w:t>
-      </w:r>
-      <w:r>
-        <w:t xml:space="preserve">.</w:t>
+        <w:t xml:space="preserve"> </w:t>
+      </w:r>
+      <w:r>
+        <w:t xml:space="preserve">shows how these mechanisms map onto the trauma-film paradigm.</w:t>
+      </w:r>
+    </w:p>
+    <w:bookmarkStart w:id="25" w:name="fig-retrieved-context-account"/>
+    <w:p>
+      <w:pPr>
+        <w:pStyle w:val="FigureWithoutNote"/>
+      </w:pPr>
+      <w:r>
+        <w:t xml:space="preserve">Figure 1</w:t>
+      </w:r>
+    </w:p>
+    <w:p>
+      <w:pPr>
+        <w:pStyle w:val="FigureWithoutNote"/>
+      </w:pPr>
+      <w:r>
+        <w:t xml:space="preserve">A retrieved-context account of selective interference.</w:t>
+      </w:r>
+      <w:r>
+        <w:t xml:space="preserve"> </w:t>
+      </w:r>
+      <w:r>
+        <w:t xml:space="preserve">The model explains intrusion-voluntary-memory dissociations by applying a single retrieved-context architecture to the phase structure of post-encoding and post-reminder interference paradigms.</w:t>
+      </w:r>
+      <w:r>
+        <w:t xml:space="preserve"> </w:t>
+      </w:r>
+      <w:r>
+        <w:t xml:space="preserve">(A) The simulated paradigm includes film encoding, optional reminder-driven context reinstatement, interference-task encoding, filler activity, and later retrieval.</w:t>
+      </w:r>
+      <w:r>
+        <w:t xml:space="preserve"> </w:t>
+      </w:r>
+      <w:r>
+        <w:t xml:space="preserve">(B) Encoding links film and task items to the context states active during their phases; task-associated context is most similar to film-associated context when task encoding occurs soon after the film, after reminder-driven reinstatement, or under matching source/emotional context.</w:t>
+      </w:r>
+      <w:r>
+        <w:t xml:space="preserve"> </w:t>
+      </w:r>
+      <w:r>
+        <w:t xml:space="preserve">(C) Feature-to-context memory (</w:t>
+      </w:r>
+      <m:oMath>
+        <m:sSup>
+          <m:e>
+            <m:r>
+              <m:t>M</m:t>
+            </m:r>
+          </m:e>
+          <m:sup>
+            <m:r>
+              <m:t>F</m:t>
+            </m:r>
+            <m:r>
+              <m:t>C</m:t>
+            </m:r>
+          </m:sup>
+        </m:sSup>
+      </m:oMath>
+      <w:r>
+        <w:t xml:space="preserve">) and context-to-feature memory (</w:t>
+      </w:r>
+      <m:oMath>
+        <m:sSup>
+          <m:e>
+            <m:r>
+              <m:t>M</m:t>
+            </m:r>
+          </m:e>
+          <m:sup>
+            <m:r>
+              <m:t>C</m:t>
+            </m:r>
+            <m:r>
+              <m:t>F</m:t>
+            </m:r>
+          </m:sup>
+        </m:sSup>
+      </m:oMath>
+      <w:r>
+        <w:t xml:space="preserve">) implement the retrieved-context cycle, allowing items and reminders to reinstate associated context and allowing current context to cue competing candidate items.</w:t>
+      </w:r>
+      <w:r>
+        <w:t xml:space="preserve"> </w:t>
+      </w:r>
+      <w:r>
+        <w:t xml:space="preserve">(D) Uncontrolled retrieval from ongoing context and deliberate recall operate over the same stored associations, but deliberate recall can be protected by film-directed cue construction and competition focusing.</w:t>
+      </w:r>
+    </w:p>
+    <w:bookmarkEnd w:id="25"/>
+    <w:p>
+      <w:pPr>
+        <w:pStyle w:val="AfterWithoutNote"/>
+      </w:pPr>
+      <w:r>
+        <w:t xml:space="preserve">Contextual similarity is established during encoding.</w:t>
+      </w:r>
+      <w:r>
+        <w:t xml:space="preserve"> </w:t>
+      </w:r>
+      <w:r>
+        <w:t xml:space="preserve">Film items and task items are distinct item representations, but each is linked to the context state active when it is encountered.</w:t>
+      </w:r>
+      <w:r>
+        <w:t xml:space="preserve"> </w:t>
+      </w:r>
+      <w:r>
+        <w:t xml:space="preserve">Task items are most likely to share film-relevant context when they are encoded soon after the film, after a reminder has reinstated film-associated context, or under matching source/emotional conditions.</w:t>
+      </w:r>
+      <w:r>
+        <w:t xml:space="preserve"> </w:t>
+      </w:r>
+      <w:r>
+        <w:t xml:space="preserve">Delay and filler activity move context away from the film, reducing the likelihood that later retrieval cues film items and task competitors together.</w:t>
+      </w:r>
+      <w:r>
+        <w:t xml:space="preserve"> </w:t>
+      </w:r>
+      <w:r>
+        <w:t xml:space="preserve">These conditions determine whether the task adds effective competitors to the film’s retrieval environment.</w:t>
       </w:r>
     </w:p>
     <w:p>
@@ -1237,7 +1358,51 @@
         <w:pStyle w:val="BodyText"/>
       </w:pPr>
       <w:r>
-        <w:t xml:space="preserve">Retrieved-context theory formalizes this binding framework with two associative pathways</w:t>
+        <w:t xml:space="preserve">Context-to-item retrieval uses the current context state to cue candidate items.</w:t>
+      </w:r>
+      <w:r>
+        <w:t xml:space="preserve"> </w:t>
+      </w:r>
+      <w:r>
+        <w:t xml:space="preserve">When a retrieval context resembles states associated with both film items and task items, the same cue supports both sets.</w:t>
+      </w:r>
+      <w:r>
+        <w:t xml:space="preserve"> </w:t>
+      </w:r>
+      <w:r>
+        <w:t xml:space="preserve">Uncontrolled retrieval from ongoing context is vulnerable to this competition: as task competitors receive support, any given film item becomes less likely to be sampled as an intrusion.</w:t>
+      </w:r>
+      <w:r>
+        <w:t xml:space="preserve"> </w:t>
+      </w:r>
+      <w:r>
+        <w:t xml:space="preserve">The size of this effect depends on the number of competitors, their learned support, and the similarity between their associated temporal or source/emotional context states and film context.</w:t>
+      </w:r>
+      <w:r>
+        <w:t xml:space="preserve"> </w:t>
+      </w:r>
+      <w:r>
+        <w:t xml:space="preserve">Perceptual modality contributes through those quantities: a visuospatial task is effective to the extent that it creates competitors with sufficient learned support or sufficiently similar associated context.</w:t>
+      </w:r>
+    </w:p>
+    <w:p>
+      <w:pPr>
+        <w:pStyle w:val="BodyText"/>
+      </w:pPr>
+      <w:r>
+        <w:t xml:space="preserve">Item-to-context associations allow recalled items, reminder cues, and supplied film items to reinstate associated context.</w:t>
+      </w:r>
+      <w:r>
+        <w:t xml:space="preserve"> </w:t>
+      </w:r>
+      <w:r>
+        <w:t xml:space="preserve">In ordinary recall, a retrieved item shifts context toward the state in which that item was encoded, making nearby studied items more likely to be retrieved next.</w:t>
+      </w:r>
+      <w:r>
+        <w:t xml:space="preserve"> </w:t>
+      </w:r>
+      <w:r>
+        <w:t xml:space="preserve">This context-updating loop is the standard retrieved-context explanation of temporal contiguity and temporally organized recall across filled delays</w:t>
       </w:r>
       <w:r>
         <w:t xml:space="preserve"> </w:t>
@@ -1259,44 +1424,6 @@
       <w:r>
         <w:t xml:space="preserve"> </w:t>
       </w:r>
-      <w:hyperlink w:anchor="ref-polyn2009context">
-        <w:r>
-          <w:rPr>
-            <w:rStyle w:val="Hyperlink"/>
-          </w:rPr>
-          <w:t xml:space="preserve">Polyn et al., 2009</w:t>
-        </w:r>
-      </w:hyperlink>
-      <w:r>
-        <w:t xml:space="preserve">)</w:t>
-      </w:r>
-      <w:r>
-        <w:t xml:space="preserve">.</w:t>
-      </w:r>
-      <w:r>
-        <w:t xml:space="preserve"> </w:t>
-      </w:r>
-      <w:r>
-        <w:t xml:space="preserve">Context-to-item associations allow the current context state to cue all events encoded in similar states, producing competitive retrieval in which events vie for recall based on the strength of their contextual match.</w:t>
-      </w:r>
-      <w:r>
-        <w:t xml:space="preserve"> </w:t>
-      </w:r>
-      <w:r>
-        <w:t xml:space="preserve">Item-to-context associations allow a recalled or re-encountered event to reinstate the context in which it was originally experienced, a mechanism absent from earlier context theories.</w:t>
-      </w:r>
-      <w:r>
-        <w:t xml:space="preserve"> </w:t>
-      </w:r>
-      <w:r>
-        <w:t xml:space="preserve">This reinstatement mechanism creates a bidirectional loop: retrieving an event drives context back toward the state present at encoding, which in turn cues neighboring events, producing the temporal contiguity effect</w:t>
-      </w:r>
-      <w:r>
-        <w:t xml:space="preserve"> </w:t>
-      </w:r>
-      <w:r>
-        <w:t xml:space="preserve">(</w:t>
-      </w:r>
       <w:hyperlink w:anchor="ref-kahana1996associative">
         <w:r>
           <w:rPr>
@@ -1325,57 +1452,65 @@
       <w:r>
         <w:t xml:space="preserve">.</w:t>
       </w:r>
-    </w:p>
-    <w:p>
-      <w:pPr>
-        <w:pStyle w:val="BodyText"/>
-      </w:pPr>
-      <w:r>
-        <w:t xml:space="preserve">The critical property for the present account is that context-to-item retrieval is competitive: any event encoded in the current contextual neighborhood is a candidate, and adding new events to that neighborhood increases retrieval competition.</w:t>
-      </w:r>
-      <w:r>
-        <w:t xml:space="preserve"> </w:t>
-      </w:r>
-      <w:r>
-        <w:t xml:space="preserve">In the trauma-film paradigm, intrusive memories arise through this pathway as ongoing context drifts near states associated with the film, cueing film events without intention.</w:t>
-      </w:r>
-      <w:r>
-        <w:t xml:space="preserve"> </w:t>
-      </w:r>
-      <w:r>
-        <w:t xml:space="preserve">When a participant performs a visuospatial task such as Tetris immediately after viewing a distressing film, the events the task produces are encoded in temporal context that overlaps substantially with the film’s contextual neighborhood.</w:t>
-      </w:r>
-      <w:r>
-        <w:t xml:space="preserve"> </w:t>
-      </w:r>
-      <w:r>
-        <w:t xml:space="preserve">When context later drifts near the film region, interference events compete alongside film events, reducing the probability that any single film event is retrieved as an intrusion.</w:t>
-      </w:r>
-      <w:r>
-        <w:t xml:space="preserve"> </w:t>
-      </w:r>
-      <w:r>
-        <w:t xml:space="preserve">The strength of this interference depends on how many competitors are encoded, how strongly they are bound, and how much their associated temporal or source/emotional context overlaps with the film’s.</w:t>
-      </w:r>
-      <w:r>
-        <w:t xml:space="preserve"> </w:t>
-      </w:r>
-      <w:r>
-        <w:t xml:space="preserve">Perceptual modality can matter in this framework, but only insofar as it changes competitor strength or overlap with the film-related context.</w:t>
-      </w:r>
-    </w:p>
-    <w:p>
-      <w:pPr>
-        <w:pStyle w:val="BodyText"/>
-      </w:pPr>
-      <w:r>
-        <w:t xml:space="preserve">The item-to-context pathway extends this account to post-reminder interference.</w:t>
-      </w:r>
-      <w:r>
-        <w:t xml:space="preserve"> </w:t>
-      </w:r>
-      <w:r>
-        <w:t xml:space="preserve">In the trauma-film paradigm, presenting a film clip as a reminder retrieves its associated film context via item-to-context retrieval, pulling the current context back toward the state present during the original viewing</w:t>
+      <w:r>
+        <w:t xml:space="preserve"> </w:t>
+      </w:r>
+      <w:r>
+        <w:t xml:space="preserve">The same dynamics allow recent but irrelevant experiences to intrude during recall of a target episode, with intrusion frequency decaying gradually over intervening time</w:t>
+      </w:r>
+      <w:r>
+        <w:t xml:space="preserve"> </w:t>
+      </w:r>
+      <w:r>
+        <w:t xml:space="preserve">(</w:t>
+      </w:r>
+      <w:hyperlink w:anchor="ref-howard2008persistence">
+        <w:r>
+          <w:rPr>
+            <w:rStyle w:val="Hyperlink"/>
+          </w:rPr>
+          <w:t xml:space="preserve">Howard et al., 2008</w:t>
+        </w:r>
+      </w:hyperlink>
+      <w:r>
+        <w:t xml:space="preserve">;</w:t>
+      </w:r>
+      <w:r>
+        <w:t xml:space="preserve"> </w:t>
+      </w:r>
+      <w:hyperlink w:anchor="ref-lohnas2015expanding">
+        <w:r>
+          <w:rPr>
+            <w:rStyle w:val="Hyperlink"/>
+          </w:rPr>
+          <w:t xml:space="preserve">Lohnas et al., 2015</w:t>
+        </w:r>
+      </w:hyperlink>
+      <w:r>
+        <w:t xml:space="preserve">;</w:t>
+      </w:r>
+      <w:r>
+        <w:t xml:space="preserve"> </w:t>
+      </w:r>
+      <w:hyperlink w:anchor="ref-zaromb2006temporal">
+        <w:r>
+          <w:rPr>
+            <w:rStyle w:val="Hyperlink"/>
+          </w:rPr>
+          <w:t xml:space="preserve">Zaromb et al., 2006</w:t>
+        </w:r>
+      </w:hyperlink>
+      <w:r>
+        <w:t xml:space="preserve">)</w:t>
+      </w:r>
+      <w:r>
+        <w:t xml:space="preserve">.</w:t>
+      </w:r>
+      <w:r>
+        <w:t xml:space="preserve"> </w:t>
+      </w:r>
+      <w:r>
+        <w:t xml:space="preserve">In delayed-interference paradigms, a reminder of the film uses this same pathway to reinstate film-associated context before task encoding</w:t>
       </w:r>
       <w:r>
         <w:t xml:space="preserve"> </w:t>
@@ -1415,19 +1550,31 @@
         <w:t xml:space="preserve"> </w:t>
       </w:r>
       <w:r>
-        <w:t xml:space="preserve">A visuospatial task performed in this reinstated state encodes competitors that overlap with the film context, enabling interference through the same contextual competition as the immediate case.</w:t>
-      </w:r>
-      <w:r>
-        <w:t xml:space="preserve"> </w:t>
-      </w:r>
-      <w:r>
-        <w:t xml:space="preserve">Interference effectiveness depends on two continuous variables: how strongly the reminder reinstates film context, and how much subsequent experience has caused the reinstated context to drift before the interference task begins.</w:t>
-      </w:r>
-      <w:r>
-        <w:t xml:space="preserve"> </w:t>
-      </w:r>
-      <w:r>
-        <w:t xml:space="preserve">In the model, delayed interference is therefore governed by graded reinstatement and overlap before competitor encoding.</w:t>
+        <w:t xml:space="preserve">Delayed interference is therefore graded by reminder strength and subsequent drift, because those quantities determine how much film-associated context remains available when the task is encoded.</w:t>
+      </w:r>
+      <w:r>
+        <w:t xml:space="preserve"> </w:t>
+      </w:r>
+      <w:r>
+        <w:t xml:space="preserve">Film-related cues during monitoring and tests that supply a film item use the same item-to-context pathway during later access.</w:t>
+      </w:r>
+      <w:r>
+        <w:t xml:space="preserve"> </w:t>
+      </w:r>
+      <w:r>
+        <w:t xml:space="preserve">They can pull retrieval context toward film-associated states or retrieve a supplied item’s associated context, reducing reliance on broad context-to-item sampling.</w:t>
+      </w:r>
+      <w:r>
+        <w:t xml:space="preserve"> </w:t>
+      </w:r>
+      <w:r>
+        <w:t xml:space="preserve">Interference items encoded later can add competitors to context-to-item retrieval, but they do not directly overwrite a film item’s own item-to-context association.</w:t>
+      </w:r>
+      <w:r>
+        <w:t xml:space="preserve"> </w:t>
+      </w:r>
+      <w:r>
+        <w:t xml:space="preserve">Recognition-like access is therefore less exposed to the contextual-competition mechanism that reduces uncontrolled retrieval from ongoing context, while deliberate free recall remains a controlled version of context-to-item search.</w:t>
       </w:r>
     </w:p>
     <w:p>
@@ -1435,189 +1582,37 @@
         <w:pStyle w:val="BodyText"/>
       </w:pPr>
       <w:r>
-        <w:t xml:space="preserve">Deliberate recall of the film presents a subtler case.</w:t>
-      </w:r>
-      <w:r>
-        <w:t xml:space="preserve"> </w:t>
-      </w:r>
-      <w:r>
-        <w:t xml:space="preserve">Like intrusions, it uses context-to-item retrieval and is therefore exposed to competitor interference.</w:t>
-      </w:r>
-      <w:r>
-        <w:t xml:space="preserve"> </w:t>
-      </w:r>
-      <w:r>
-        <w:t xml:space="preserve">Two control mechanisms can partially offset this vulnerability.</w:t>
-      </w:r>
-      <w:r>
-        <w:t xml:space="preserve"> </w:t>
-      </w:r>
-      <w:r>
-        <w:t xml:space="preserve">Reinstating the film’s starting context as the initial retrieval cue biases recall toward the film region and away from the interference neighborhood; sharpening competition among candidates amplifies strongly associated film events relative to weakly matched competitors.</w:t>
-      </w:r>
-      <w:r>
-        <w:t xml:space="preserve"> </w:t>
-      </w:r>
-      <w:r>
-        <w:t xml:space="preserve">Together, these mechanisms produce graded protection, with the degree of sparing depending on how much control the participant exerts.</w:t>
+        <w:t xml:space="preserve">Deliberate recall is protected only to the extent that retrieval control changes the search.</w:t>
+      </w:r>
+      <w:r>
+        <w:t xml:space="preserve"> </w:t>
+      </w:r>
+      <w:r>
+        <w:t xml:space="preserve">Like uncontrolled retrieval, deliberate recall uses context-to-item retrieval and remains exposed to competitor interference.</w:t>
+      </w:r>
+      <w:r>
+        <w:t xml:space="preserve"> </w:t>
+      </w:r>
+      <w:r>
+        <w:t xml:space="preserve">The first control lever is cue construction or start-state control, which reinstates film-associated context before recall and biases search toward film items.</w:t>
+      </w:r>
+      <w:r>
+        <w:t xml:space="preserve"> </w:t>
+      </w:r>
+      <w:r>
+        <w:t xml:space="preserve">The second is competition focusing or filtering, which sharpens selection among candidates and favors strongly supported film items over weaker or off-target competitors.</w:t>
+      </w:r>
+      <w:r>
+        <w:t xml:space="preserve"> </w:t>
+      </w:r>
+      <w:r>
+        <w:t xml:space="preserve">These levers yield graded protection: deliberate recall can lose film items when competition is strong, but control can reduce that loss relative to uncontrolled retrieval from ongoing context.</w:t>
       </w:r>
     </w:p>
     <w:p>
       <w:pPr>
         <w:pStyle w:val="BodyText"/>
       </w:pPr>
-      <w:r>
-        <w:t xml:space="preserve">Item-to-context retrieval is less exposed to contextual competition than context-to-item retrieval.</w:t>
-      </w:r>
-      <w:r>
-        <w:t xml:space="preserve"> </w:t>
-      </w:r>
-      <w:r>
-        <w:t xml:space="preserve">For example, in recognition, the test supplies a film item as the retrieval probe rather than asking the current context to sample among film and task competitors.</w:t>
-      </w:r>
-      <w:r>
-        <w:t xml:space="preserve"> </w:t>
-      </w:r>
-      <w:r>
-        <w:t xml:space="preserve">The probe retrieves its own associated context through item-to-context associations formed during film encoding.</w:t>
-      </w:r>
-      <w:r>
-        <w:t xml:space="preserve"> </w:t>
-      </w:r>
-      <w:r>
-        <w:t xml:space="preserve">Interference items encoded later can add competitors to context-to-item retrieval, but they do not directly overwrite the film item’s own item-to-context association.</w:t>
-      </w:r>
-      <w:r>
-        <w:t xml:space="preserve"> </w:t>
-      </w:r>
-      <w:r>
-        <w:t xml:space="preserve">Recognition-like access therefore leaves little room for the contextual-competition mechanism that reduces intrusion-like recall.</w:t>
-      </w:r>
-      <w:r>
-        <w:t xml:space="preserve"> </w:t>
-      </w:r>
-      <w:r>
-        <w:t xml:space="preserve">This protection is different from the graded protection available to deliberate free recall, which still depends on context-to-item retrieval and must use control to favor film items over competitors.</w:t>
-      </w:r>
-    </w:p>
-    <w:p>
-      <w:pPr>
-        <w:pStyle w:val="BodyText"/>
-      </w:pPr>
-      <w:r>
-        <w:t xml:space="preserve">These mechanisms reproduce several core findings from the episodic memory literature.</w:t>
-      </w:r>
-      <w:r>
-        <w:t xml:space="preserve"> </w:t>
-      </w:r>
-      <w:r>
-        <w:t xml:space="preserve">In free recall, the context-reinstatement loop accounts for temporal contiguity (the tendency to recall temporally neighboring events in sequence) and for the persistence of this pattern across long filled delays</w:t>
-      </w:r>
-      <w:r>
-        <w:t xml:space="preserve"> </w:t>
-      </w:r>
-      <w:r>
-        <w:t xml:space="preserve">(</w:t>
-      </w:r>
-      <w:hyperlink w:anchor="ref-howard2002distributed">
-        <w:r>
-          <w:rPr>
-            <w:rStyle w:val="Hyperlink"/>
-          </w:rPr>
-          <w:t xml:space="preserve">Howard &amp; Kahana, 2002</w:t>
-        </w:r>
-      </w:hyperlink>
-      <w:r>
-        <w:t xml:space="preserve">;</w:t>
-      </w:r>
-      <w:r>
-        <w:t xml:space="preserve"> </w:t>
-      </w:r>
-      <w:hyperlink w:anchor="ref-kahana1996associative">
-        <w:r>
-          <w:rPr>
-            <w:rStyle w:val="Hyperlink"/>
-          </w:rPr>
-          <w:t xml:space="preserve">Kahana, 1996</w:t>
-        </w:r>
-      </w:hyperlink>
-      <w:r>
-        <w:t xml:space="preserve">;</w:t>
-      </w:r>
-      <w:r>
-        <w:t xml:space="preserve"> </w:t>
-      </w:r>
-      <w:hyperlink w:anchor="ref-sederberg2008context">
-        <w:r>
-          <w:rPr>
-            <w:rStyle w:val="Hyperlink"/>
-          </w:rPr>
-          <w:t xml:space="preserve">Sederberg et al., 2008</w:t>
-        </w:r>
-      </w:hyperlink>
-      <w:r>
-        <w:t xml:space="preserve">)</w:t>
-      </w:r>
-      <w:r>
-        <w:t xml:space="preserve">.</w:t>
-      </w:r>
-      <w:r>
-        <w:t xml:space="preserve"> </w:t>
-      </w:r>
-      <w:r>
-        <w:t xml:space="preserve">Memories from recent but irrelevant experiences also intrude during recall of a target episode, with a frequency that decays gradually over intervening time</w:t>
-      </w:r>
-      <w:r>
-        <w:t xml:space="preserve"> </w:t>
-      </w:r>
-      <w:r>
-        <w:t xml:space="preserve">(</w:t>
-      </w:r>
-      <w:hyperlink w:anchor="ref-howard2008persistence">
-        <w:r>
-          <w:rPr>
-            <w:rStyle w:val="Hyperlink"/>
-          </w:rPr>
-          <w:t xml:space="preserve">Howard et al., 2008</w:t>
-        </w:r>
-      </w:hyperlink>
-      <w:r>
-        <w:t xml:space="preserve">;</w:t>
-      </w:r>
-      <w:r>
-        <w:t xml:space="preserve"> </w:t>
-      </w:r>
-      <w:hyperlink w:anchor="ref-lohnas2015expanding">
-        <w:r>
-          <w:rPr>
-            <w:rStyle w:val="Hyperlink"/>
-          </w:rPr>
-          <w:t xml:space="preserve">Lohnas et al., 2015</w:t>
-        </w:r>
-      </w:hyperlink>
-      <w:r>
-        <w:t xml:space="preserve">;</w:t>
-      </w:r>
-      <w:r>
-        <w:t xml:space="preserve"> </w:t>
-      </w:r>
-      <w:hyperlink w:anchor="ref-zaromb2006temporal">
-        <w:r>
-          <w:rPr>
-            <w:rStyle w:val="Hyperlink"/>
-          </w:rPr>
-          <w:t xml:space="preserve">Zaromb et al., 2006</w:t>
-        </w:r>
-      </w:hyperlink>
-      <w:r>
-        <w:t xml:space="preserve">)</w:t>
-      </w:r>
-      <w:r>
-        <w:t xml:space="preserve">.</w:t>
-      </w:r>
-      <w:r>
-        <w:t xml:space="preserve"> </w:t>
-      </w:r>
       <w:r>
         <w:t xml:space="preserve">Emotional extensions of CMR add a source-context stream that can distinguish items encoded in emotional versus neutral states</w:t>
       </w:r>
@@ -1659,43 +1654,17 @@
         <w:t xml:space="preserve"> </w:t>
       </w:r>
       <w:r>
-        <w:t xml:space="preserve">In the present source-only variant, this stream is used to represent whether film and task items share or differ in source/emotional context.</w:t>
-      </w:r>
-    </w:p>
-    <w:p>
-      <w:pPr>
-        <w:pStyle w:val="BodyText"/>
-      </w:pPr>
-      <w:r>
-        <w:t xml:space="preserve">The resulting account has three operative ingredients.</w:t>
-      </w:r>
-      <w:r>
-        <w:t xml:space="preserve"> </w:t>
-      </w:r>
-      <w:r>
-        <w:t xml:space="preserve">Intrusion-like and deliberate recall operate over the same item-context associations, but they begin from different retrieval states and differ in how strongly retrieval is constrained toward the film.</w:t>
-      </w:r>
-      <w:r>
-        <w:t xml:space="preserve"> </w:t>
-      </w:r>
-      <w:r>
-        <w:t xml:space="preserve">Interference strength is determined by the number and strength of task competitors and by their overlap with film-related temporal and source/emotional context.</w:t>
-      </w:r>
-      <w:r>
-        <w:t xml:space="preserve"> </w:t>
-      </w:r>
-      <w:r>
-        <w:t xml:space="preserve">Post-reminder effects arise when a reminder reinstates film context before competitor encoding.</w:t>
-      </w:r>
-      <w:r>
-        <w:t xml:space="preserve"> </w:t>
-      </w:r>
-      <w:r>
-        <w:t xml:space="preserve">These commitments define the model components specified next: phase-specific encoding, reminder-driven reinstatement, and retrieval-mode settings.</w:t>
-      </w:r>
-    </w:p>
-    <w:bookmarkEnd w:id="25"/>
-    <w:bookmarkStart w:id="37" w:name="model-and-paradigm"/>
+        <w:t xml:space="preserve">In the present source-only variant, this stream represents whether film and task items are associated with matching or different source/emotional context states.</w:t>
+      </w:r>
+      <w:r>
+        <w:t xml:space="preserve"> </w:t>
+      </w:r>
+      <w:r>
+        <w:t xml:space="preserve">The formal model specified next instantiates these commitments as phase-specific encoding, reminder-driven reinstatement, retrieval-mode and control settings, and source/emotional overlap.</w:t>
+      </w:r>
+    </w:p>
+    <w:bookmarkEnd w:id="26"/>
+    <w:bookmarkStart w:id="38" w:name="model-and-paradigm"/>
     <w:p>
       <w:pPr>
         <w:pStyle w:val="Heading1"/>
@@ -1704,7 +1673,7 @@
         <w:t xml:space="preserve">Model and Paradigm</w:t>
       </w:r>
     </w:p>
-    <w:bookmarkStart w:id="27" w:name="representations-and-memory-architecture"/>
+    <w:bookmarkStart w:id="28" w:name="representations-and-memory-architecture"/>
     <w:p>
       <w:pPr>
         <w:pStyle w:val="Heading2"/>
@@ -2122,7 +2091,7 @@
         <w:t xml:space="preserve">lists the model structures and parameters used throughout the simulations.</w:t>
       </w:r>
     </w:p>
-    <w:bookmarkStart w:id="26" w:name="tbl-parameters"/>
+    <w:bookmarkStart w:id="27" w:name="tbl-parameters"/>
     <w:p>
       <w:pPr>
         <w:pStyle w:val="FigureTitle"/>
@@ -3399,9 +3368,9 @@
         </w:tc>
       </w:tr>
     </w:tbl>
-    <w:bookmarkEnd w:id="26"/>
     <w:bookmarkEnd w:id="27"/>
-    <w:bookmarkStart w:id="28" w:name="pre-experimental-associations"/>
+    <w:bookmarkEnd w:id="28"/>
+    <w:bookmarkStart w:id="29" w:name="pre-experimental-associations"/>
     <w:p>
       <w:pPr>
         <w:pStyle w:val="Heading2"/>
@@ -3828,7 +3797,7 @@
         <w:t xml:space="preserve"> </w:t>
       </w:r>
       <w:r>
-        <w:t xml:space="preserve">For item-specific context units,</w:t>
+        <w:t xml:space="preserve">For context units corresponding to items,</w:t>
       </w:r>
       <w:r>
         <w:t xml:space="preserve"> </w:t>
@@ -4179,8 +4148,8 @@
         <w:t xml:space="preserve">Source-based competition is learned during encoding and is controlled by the source learning scale.</w:t>
       </w:r>
     </w:p>
-    <w:bookmarkEnd w:id="28"/>
-    <w:bookmarkStart w:id="29" w:name="encoding-across-phases"/>
+    <w:bookmarkEnd w:id="29"/>
+    <w:bookmarkStart w:id="30" w:name="encoding-across-phases"/>
     <w:p>
       <w:pPr>
         <w:pStyle w:val="Heading2"/>
@@ -4278,7 +4247,7 @@
         <w:t xml:space="preserve"> </w:t>
       </w:r>
       <w:r>
-        <w:t xml:space="preserve">The interference phase encodes task items whose effect depends on their strength and their overlap with film context.</w:t>
+        <w:t xml:space="preserve">The interference phase encodes task items whose effect depends on their strength and the similarity between their associated context states and film context.</w:t>
       </w:r>
     </w:p>
     <w:p>
@@ -5233,8 +5202,8 @@
         <w:t xml:space="preserve">The primary source-only eCMR variant does not allow source/emotional status to modulate temporal context-to-item learning; temporal learning remains primacy-driven unless a later sensitivity analysis explicitly turns on broad temporal modulation.</w:t>
       </w:r>
     </w:p>
-    <w:bookmarkEnd w:id="29"/>
-    <w:bookmarkStart w:id="31" w:name="sourceemotional-context"/>
+    <w:bookmarkEnd w:id="30"/>
+    <w:bookmarkStart w:id="32" w:name="sourceemotional-context"/>
     <w:p>
       <w:pPr>
         <w:pStyle w:val="Heading2"/>
@@ -5850,7 +5819,7 @@
         <w:t xml:space="preserve"> </w:t>
       </w:r>
       <w:r>
-        <w:t xml:space="preserve">When film and interference items share source/emotional status, the source pathway can increase target-competitor overlap beyond temporal proximity alone.</w:t>
+        <w:t xml:space="preserve">When film and interference items share source/emotional status, the source pathway can increase overlap between the context cues supporting target and competitor items beyond temporal proximity alone.</w:t>
       </w:r>
     </w:p>
     <w:p>
@@ -5899,7 +5868,7 @@
         <w:t xml:space="preserve">learning scale, which controls competitor encoding strength.</w:t>
       </w:r>
     </w:p>
-    <w:bookmarkStart w:id="30" w:name="tbl-phase-scales"/>
+    <w:bookmarkStart w:id="31" w:name="tbl-phase-scales"/>
     <w:p>
       <w:pPr>
         <w:pStyle w:val="FigureTitle"/>
@@ -6453,7 +6422,7 @@
         </w:tc>
       </w:tr>
     </w:tbl>
-    <w:bookmarkEnd w:id="30"/>
+    <w:bookmarkEnd w:id="31"/>
     <w:p>
       <w:pPr>
         <w:pStyle w:val="AfterWithoutNote"/>
@@ -6544,8 +6513,8 @@
         <w:t xml:space="preserve">Together, drift and learning scales define whether interference is merely added experience or a set of strong competitors encoded into film-related context.</w:t>
       </w:r>
     </w:p>
-    <w:bookmarkEnd w:id="31"/>
-    <w:bookmarkStart w:id="32" w:name="reminder-reinstatement"/>
+    <w:bookmarkEnd w:id="32"/>
+    <w:bookmarkStart w:id="33" w:name="reminder-reinstatement"/>
     <w:p>
       <w:pPr>
         <w:pStyle w:val="Heading2"/>
@@ -6876,7 +6845,7 @@
         <w:t xml:space="preserve"> </w:t>
       </w:r>
       <w:r>
-        <w:t xml:space="preserve">This partial reinstatement moves context back toward the general region of the film’s temporal neighborhood.</w:t>
+        <w:t xml:space="preserve">This partial reinstatement moves context back toward temporal states associated with film encoding.</w:t>
       </w:r>
     </w:p>
     <w:p>
@@ -7539,7 +7508,7 @@
         <w:t xml:space="preserve"> </w:t>
       </w:r>
       <w:r>
-        <w:t xml:space="preserve">By pulling context back toward the film neighborhood, the reminder makes interference items encoded immediately afterward share temporal and potentially source context with the film.</w:t>
+        <w:t xml:space="preserve">By pulling context back toward film-associated states, the reminder makes interference items encoded immediately afterward associated with temporal and potentially source context similar to the film context.</w:t>
       </w:r>
       <w:r>
         <w:t xml:space="preserve"> </w:t>
@@ -7574,7 +7543,7 @@
         <w:t xml:space="preserve"> </w:t>
       </w:r>
       <w:r>
-        <w:t xml:space="preserve">closer to 1) produces more overlap, and hence more competition, between film targets and interference competitors.</w:t>
+        <w:t xml:space="preserve">closer to 1) produces more overlap between the context cues supporting film targets and interference competitors.</w:t>
       </w:r>
       <w:r>
         <w:t xml:space="preserve"> </w:t>
@@ -7583,8 +7552,8 @@
         <w:t xml:space="preserve">Delayed-interference simulations therefore manipulate reminder reinstatement as a graded overlap mechanism rather than as an all-or-none reactivation window.</w:t>
       </w:r>
     </w:p>
-    <w:bookmarkEnd w:id="32"/>
-    <w:bookmarkStart w:id="33" w:name="retrieval-and-termination"/>
+    <w:bookmarkEnd w:id="33"/>
+    <w:bookmarkStart w:id="34" w:name="retrieval-and-termination"/>
     <w:p>
       <w:pPr>
         <w:pStyle w:val="Heading2"/>
@@ -9118,14 +9087,14 @@
         <w:t xml:space="preserve">This mechanism produces the temporal organization expected of retrieved-context models.</w:t>
       </w:r>
     </w:p>
-    <w:bookmarkEnd w:id="33"/>
-    <w:bookmarkStart w:id="34" w:name="retrieval-configurations"/>
+    <w:bookmarkEnd w:id="34"/>
+    <w:bookmarkStart w:id="35" w:name="retrieval-modes-and-control-settings"/>
     <w:p>
       <w:pPr>
         <w:pStyle w:val="Heading2"/>
       </w:pPr>
       <w:r>
-        <w:t xml:space="preserve">Retrieval Configurations</w:t>
+        <w:t xml:space="preserve">Retrieval Modes and Control Settings</w:t>
       </w:r>
     </w:p>
     <w:p>
@@ -9133,7 +9102,7 @@
         <w:pStyle w:val="FirstParagraph"/>
       </w:pPr>
       <w:r>
-        <w:t xml:space="preserve">The simulations vary retrieval configuration without changing the stored film and task episodes.</w:t>
+        <w:t xml:space="preserve">The simulations vary retrieval mode and film-directed control settings without changing the stored film and task episodes.</w:t>
       </w:r>
       <w:r>
         <w:t xml:space="preserve"> </w:t>
@@ -9159,13 +9128,13 @@
         <w:pStyle w:val="BodyText"/>
       </w:pPr>
       <w:r>
-        <w:t xml:space="preserve">Probe-driven access is treated as a boundary case rather than as a categorical immunity claim.</w:t>
-      </w:r>
-      <w:r>
-        <w:t xml:space="preserve"> </w:t>
-      </w:r>
-      <w:r>
-        <w:t xml:space="preserve">When a film item is supplied as a probe, it can retrieve its own associated context through item-to-context memory:</w:t>
+        <w:t xml:space="preserve">Probe-driven access uses the item-to-context pathway to reduce reliance on broad context-to-item search.</w:t>
+      </w:r>
+      <w:r>
+        <w:t xml:space="preserve"> </w:t>
+      </w:r>
+      <w:r>
+        <w:t xml:space="preserve">When a test supplies a film item, that item can retrieve its own associated context through item-to-context memory:</w:t>
       </w:r>
     </w:p>
     <w:p>
@@ -9256,17 +9225,17 @@
         <w:pStyle w:val="FirstParagraph"/>
       </w:pPr>
       <w:r>
-        <w:t xml:space="preserve">This route supplies more item-specific information than broad context-to-item search.</w:t>
-      </w:r>
-      <w:r>
-        <w:t xml:space="preserve"> </w:t>
-      </w:r>
-      <w:r>
-        <w:t xml:space="preserve">It should therefore be less exposed to competitors encoded near the film context, although the manuscript treats this as a boundary case to be interpreted alongside the task design rather than as an absolute recognition result.</w:t>
-      </w:r>
-    </w:p>
-    <w:bookmarkEnd w:id="34"/>
-    <w:bookmarkStart w:id="36" w:name="parameters-and-simulation-factors"/>
+        <w:t xml:space="preserve">This route supplies more target-specific information than broad context-to-item search.</w:t>
+      </w:r>
+      <w:r>
+        <w:t xml:space="preserve"> </w:t>
+      </w:r>
+      <w:r>
+        <w:t xml:space="preserve">It should therefore be less exposed to competitors encoded near the film context, although the manuscript treats recognition-like access as a probe-driven case to be interpreted alongside the task design rather than as an absolute recognition result.</w:t>
+      </w:r>
+    </w:p>
+    <w:bookmarkEnd w:id="35"/>
+    <w:bookmarkStart w:id="37" w:name="parameters-and-simulation-factors"/>
     <w:p>
       <w:pPr>
         <w:pStyle w:val="Heading2"/>
@@ -9340,7 +9309,7 @@
         <w:t xml:space="preserve">lists the main scale factors and their theoretical roles.</w:t>
       </w:r>
     </w:p>
-    <w:bookmarkStart w:id="35" w:name="tbl-scale-factors"/>
+    <w:bookmarkStart w:id="36" w:name="tbl-scale-factors"/>
     <w:p>
       <w:pPr>
         <w:pStyle w:val="FigureTitle"/>
@@ -9868,7 +9837,7 @@
               <w:pStyle w:val="Compact"/>
             </w:pPr>
             <w:r>
-              <w:t xml:space="preserve">Target-competitor contextual overlap</w:t>
+              <w:t xml:space="preserve">Target-competitor cue overlap</w:t>
             </w:r>
           </w:p>
         </w:tc>
@@ -10310,7 +10279,7 @@
               <w:pStyle w:val="Compact"/>
             </w:pPr>
             <w:r>
-              <w:t xml:space="preserve">Source/emotional overlap</w:t>
+              <w:t xml:space="preserve">Source/emotional cue overlap</w:t>
             </w:r>
           </w:p>
         </w:tc>
@@ -10407,7 +10376,7 @@
               <w:pStyle w:val="Compact"/>
             </w:pPr>
             <w:r>
-              <w:t xml:space="preserve">Source/emotional overlap</w:t>
+              <w:t xml:space="preserve">Source/emotional cue overlap</w:t>
             </w:r>
           </w:p>
         </w:tc>
@@ -10617,7 +10586,7 @@
         </w:tc>
       </w:tr>
     </w:tbl>
-    <w:bookmarkEnd w:id="35"/>
+    <w:bookmarkEnd w:id="36"/>
     <w:p>
       <w:pPr>
         <w:pStyle w:val="AfterWithoutNote"/>
@@ -10664,9 +10633,9 @@
         <w:t xml:space="preserve">These dependent measures provide a bridge between the model’s formal predictions and the empirical phenomena the simulations target.</w:t>
       </w:r>
     </w:p>
-    <w:bookmarkEnd w:id="36"/>
     <w:bookmarkEnd w:id="37"/>
-    <w:bookmarkStart w:id="48" w:name="simulations"/>
+    <w:bookmarkEnd w:id="38"/>
+    <w:bookmarkStart w:id="49" w:name="simulations"/>
     <w:p>
       <w:pPr>
         <w:pStyle w:val="Heading1"/>
@@ -10689,13 +10658,13 @@
         <w:t xml:space="preserve">These plots are diagnostic outputs from the interference-strength sweep, not stand-alone evidence for the full intrusion-voluntary-memory dissociation.</w:t>
       </w:r>
     </w:p>
-    <w:bookmarkStart w:id="41" w:name="fig-interference-sweep-spc"/>
+    <w:bookmarkStart w:id="42" w:name="fig-interference-sweep-spc"/>
     <w:p>
       <w:pPr>
         <w:pStyle w:val="FigureTitle"/>
       </w:pPr>
       <w:r>
-        <w:t xml:space="preserve">Figure 1</w:t>
+        <w:t xml:space="preserve">Figure 2</w:t>
       </w:r>
     </w:p>
     <w:p>
@@ -10733,18 +10702,18 @@
           <wp:inline>
             <wp:extent cx="5943600" cy="2214422"/>
             <wp:effectExtent b="0" l="0" r="0" t="0"/>
-            <wp:docPr descr="" title="" id="39" name="Picture"/>
+            <wp:docPr descr="" title="" id="40" name="Picture"/>
             <a:graphic>
               <a:graphicData uri="http://schemas.openxmlformats.org/drawingml/2006/picture">
                 <pic:pic>
                   <pic:nvPicPr>
-                    <pic:cNvPr descr="figures/interference_mcf_scale_delay16_fit_no_shared_support_side_by_side_spc.png" id="40" name="Picture"/>
+                    <pic:cNvPr descr="figures/interference_mcf_scale_delay16_fit_no_shared_support_side_by_side_spc.png" id="41" name="Picture"/>
                     <pic:cNvPicPr>
                       <a:picLocks noChangeArrowheads="1" noChangeAspect="1"/>
                     </pic:cNvPicPr>
                   </pic:nvPicPr>
                   <pic:blipFill>
-                    <a:blip r:embed="rId38"/>
+                    <a:blip r:embed="rId39"/>
                     <a:stretch>
                       <a:fillRect/>
                     </a:stretch>
@@ -10771,8 +10740,8 @@
         </w:drawing>
       </w:r>
     </w:p>
-    <w:bookmarkEnd w:id="41"/>
-    <w:bookmarkStart w:id="42" w:name="X6fcf3f39085e398ac9304fc9201661bcf62a397"/>
+    <w:bookmarkEnd w:id="42"/>
+    <w:bookmarkStart w:id="43" w:name="X6fcf3f39085e398ac9304fc9201661bcf62a397"/>
     <w:p>
       <w:pPr>
         <w:pStyle w:val="Heading2"/>
@@ -10786,7 +10755,7 @@
         <w:pStyle w:val="FirstParagraph"/>
       </w:pPr>
       <w:r>
-        <w:t xml:space="preserve">Premise: The basic selective-interference result is a 2 x 2 contrast between interference condition and retrieval configuration.</w:t>
+        <w:t xml:space="preserve">Premise: The basic selective-interference result is a 2 x 2 contrast between interference condition and retrieval mode.</w:t>
       </w:r>
       <w:r>
         <w:t xml:space="preserve"> </w:t>
@@ -10815,8 +10784,8 @@
         <w:t xml:space="preserve">Deliberate recall may still be impaired; the claim is relative protection, not immunity.</w:t>
       </w:r>
     </w:p>
-    <w:bookmarkEnd w:id="42"/>
-    <w:bookmarkStart w:id="43" w:name="Xc677d8ae7f532696a9d0dc1c16d289e7eda8c6a"/>
+    <w:bookmarkEnd w:id="43"/>
+    <w:bookmarkStart w:id="44" w:name="Xc677d8ae7f532696a9d0dc1c16d289e7eda8c6a"/>
     <w:p>
       <w:pPr>
         <w:pStyle w:val="Heading2"/>
@@ -10871,8 +10840,8 @@
         <w:t xml:space="preserve">Weakening these control operations should make deliberate recall resemble intrusion-like retrieval more closely.</w:t>
       </w:r>
     </w:p>
-    <w:bookmarkEnd w:id="43"/>
-    <w:bookmarkStart w:id="44" w:name="Xb6ad65f068ff1c87b9d8ef63a15a1d3a2d01552"/>
+    <w:bookmarkEnd w:id="44"/>
+    <w:bookmarkStart w:id="45" w:name="Xb6ad65f068ff1c87b9d8ef63a15a1d3a2d01552"/>
     <w:p>
       <w:pPr>
         <w:pStyle w:val="Heading2"/>
@@ -10886,7 +10855,7 @@
         <w:pStyle w:val="FirstParagraph"/>
       </w:pPr>
       <w:r>
-        <w:t xml:space="preserve">Premise: An interference task matters when it encodes competitors that are both strong enough and contextually close enough to film items.</w:t>
+        <w:t xml:space="preserve">Premise: An interference task becomes effective when it encodes competitors with enough learned support and with associated context states similar enough to film context.</w:t>
       </w:r>
       <w:r>
         <w:t xml:space="preserve"> </w:t>
@@ -10915,8 +10884,8 @@
         <w:t xml:space="preserve">Competitor strength matters because competitors are retrievable from film-related context, and shared source/emotional context is relevant only insofar as it increases that competition.</w:t>
       </w:r>
     </w:p>
-    <w:bookmarkEnd w:id="44"/>
-    <w:bookmarkStart w:id="45" w:name="Xb79b6d9c7815cdfa2786fb98ac16b20d71daf8e"/>
+    <w:bookmarkEnd w:id="45"/>
+    <w:bookmarkStart w:id="46" w:name="Xb79b6d9c7815cdfa2786fb98ac16b20d71daf8e"/>
     <w:p>
       <w:pPr>
         <w:pStyle w:val="Heading2"/>
@@ -10959,8 +10928,8 @@
         <w:t xml:space="preserve">It restores the contextual condition required for later competitor encoding to affect film-item retrieval.</w:t>
       </w:r>
     </w:p>
-    <w:bookmarkEnd w:id="45"/>
-    <w:bookmarkStart w:id="46" w:name="Xa3f451a9d82748e70976ed4f14c9634de5024b1"/>
+    <w:bookmarkEnd w:id="46"/>
+    <w:bookmarkStart w:id="47" w:name="Xa3f451a9d82748e70976ed4f14c9634de5024b1"/>
     <w:p>
       <w:pPr>
         <w:pStyle w:val="Heading2"/>
@@ -10997,14 +10966,14 @@
         <w:t xml:space="preserve">The model predicts a continuum of vulnerability across recall-like tests depending on how much the task supports film-directed retrieval.</w:t>
       </w:r>
     </w:p>
-    <w:bookmarkEnd w:id="46"/>
-    <w:bookmarkStart w:id="47" w:name="X305caec8649757f6c49a20df21f72b599ba7726"/>
+    <w:bookmarkEnd w:id="47"/>
+    <w:bookmarkStart w:id="48" w:name="Xd899c74baf6ef599438daabd3dfd1a19bfff423"/>
     <w:p>
       <w:pPr>
         <w:pStyle w:val="Heading2"/>
       </w:pPr>
       <w:r>
-        <w:t xml:space="preserve">Simulation 6: Probe-Driven Access as a Boundary Case</w:t>
+        <w:t xml:space="preserve">Simulation 6: Probe-Driven Access in Recognition-Like Tests</w:t>
       </w:r>
     </w:p>
     <w:p>
@@ -11012,7 +10981,7 @@
         <w:pStyle w:val="FirstParagraph"/>
       </w:pPr>
       <w:r>
-        <w:t xml:space="preserve">Premise: Item-specific probes are a limiting case of voluntary access because they begin closer to the target item than broad recall does.</w:t>
+        <w:t xml:space="preserve">Premise: Tests that supply a film item are a limiting case of voluntary access because they begin closer to the target item than broad recall does.</w:t>
       </w:r>
       <w:r>
         <w:t xml:space="preserve"> </w:t>
@@ -11026,18 +10995,18 @@
         <w:pStyle w:val="BodyText"/>
       </w:pPr>
       <w:r>
-        <w:t xml:space="preserve">Intended text take-away: This section handles film-specific probes and recognition-like measures as a boundary case.</w:t>
-      </w:r>
-      <w:r>
-        <w:t xml:space="preserve"> </w:t>
-      </w:r>
-      <w:r>
-        <w:t xml:space="preserve">The claim is that probe-driven access reduces exposure to competitor competition, not that recognition escapes the mechanism in every design or that all voluntary memory has the same protection.</w:t>
-      </w:r>
-    </w:p>
-    <w:bookmarkEnd w:id="47"/>
+        <w:t xml:space="preserve">Intended text take-away: This section handles tests that supply a film item and recognition-like measures as a probe-driven access case.</w:t>
+      </w:r>
+      <w:r>
+        <w:t xml:space="preserve"> </w:t>
+      </w:r>
+      <w:r>
+        <w:t xml:space="preserve">The claim is that probe-driven access reduces exposure to contextual competition, not that recognition escapes the mechanism in every design or that all voluntary memory has the same protection.</w:t>
+      </w:r>
+    </w:p>
     <w:bookmarkEnd w:id="48"/>
-    <w:bookmarkStart w:id="49" w:name="general-discussion"/>
+    <w:bookmarkEnd w:id="49"/>
+    <w:bookmarkStart w:id="50" w:name="general-discussion"/>
     <w:p>
       <w:pPr>
         <w:pStyle w:val="Heading1"/>
@@ -11046,7 +11015,7 @@
         <w:t xml:space="preserve">General Discussion</w:t>
       </w:r>
     </w:p>
-    <w:bookmarkEnd w:id="49"/>
+    <w:bookmarkEnd w:id="50"/>
     <w:bookmarkStart w:id="115" w:name="references"/>
     <w:p>
       <w:pPr>
@@ -11057,7 +11026,7 @@
       </w:r>
     </w:p>
     <w:bookmarkStart w:id="114" w:name="refs"/>
-    <w:bookmarkStart w:id="51" w:name="ref-asselbergs2023systematic"/>
+    <w:bookmarkStart w:id="52" w:name="ref-asselbergs2023systematic"/>
     <w:p>
       <w:pPr>
         <w:pStyle w:val="Bibliography"/>
@@ -11094,7 +11063,7 @@
       <w:r>
         <w:t xml:space="preserve"> </w:t>
       </w:r>
-      <w:hyperlink r:id="rId50">
+      <w:hyperlink r:id="rId51">
         <w:r>
           <w:rPr>
             <w:rStyle w:val="Hyperlink"/>
@@ -11103,8 +11072,8 @@
         </w:r>
       </w:hyperlink>
     </w:p>
-    <w:bookmarkEnd w:id="51"/>
-    <w:bookmarkStart w:id="53" w:name="ref-brewin2014episodic"/>
+    <w:bookmarkEnd w:id="52"/>
+    <w:bookmarkStart w:id="54" w:name="ref-brewin2014episodic"/>
     <w:p>
       <w:pPr>
         <w:pStyle w:val="Bibliography"/>
@@ -11141,7 +11110,7 @@
       <w:r>
         <w:t xml:space="preserve"> </w:t>
       </w:r>
-      <w:hyperlink r:id="rId52">
+      <w:hyperlink r:id="rId53">
         <w:r>
           <w:rPr>
             <w:rStyle w:val="Hyperlink"/>
@@ -11150,8 +11119,8 @@
         </w:r>
       </w:hyperlink>
     </w:p>
-    <w:bookmarkEnd w:id="53"/>
-    <w:bookmarkStart w:id="55" w:name="ref-brewin1996dual"/>
+    <w:bookmarkEnd w:id="54"/>
+    <w:bookmarkStart w:id="56" w:name="ref-brewin1996dual"/>
     <w:p>
       <w:pPr>
         <w:pStyle w:val="Bibliography"/>
@@ -11188,7 +11157,7 @@
       <w:r>
         <w:t xml:space="preserve"> </w:t>
       </w:r>
-      <w:hyperlink r:id="rId54">
+      <w:hyperlink r:id="rId55">
         <w:r>
           <w:rPr>
             <w:rStyle w:val="Hyperlink"/>
@@ -11197,8 +11166,8 @@
         </w:r>
       </w:hyperlink>
     </w:p>
-    <w:bookmarkEnd w:id="55"/>
-    <w:bookmarkStart w:id="57" w:name="ref-brewin2010intrusive"/>
+    <w:bookmarkEnd w:id="56"/>
+    <w:bookmarkStart w:id="58" w:name="ref-brewin2010intrusive"/>
     <w:p>
       <w:pPr>
         <w:pStyle w:val="Bibliography"/>
@@ -11235,7 +11204,7 @@
       <w:r>
         <w:t xml:space="preserve"> </w:t>
       </w:r>
-      <w:hyperlink r:id="rId56">
+      <w:hyperlink r:id="rId57">
         <w:r>
           <w:rPr>
             <w:rStyle w:val="Hyperlink"/>
@@ -11244,8 +11213,8 @@
         </w:r>
       </w:hyperlink>
     </w:p>
-    <w:bookmarkEnd w:id="57"/>
-    <w:bookmarkStart w:id="59" w:name="ref-cohen2022memory"/>
+    <w:bookmarkEnd w:id="58"/>
+    <w:bookmarkStart w:id="60" w:name="ref-cohen2022memory"/>
     <w:p>
       <w:pPr>
         <w:pStyle w:val="Bibliography"/>
@@ -11282,7 +11251,7 @@
       <w:r>
         <w:t xml:space="preserve"> </w:t>
       </w:r>
-      <w:hyperlink r:id="rId58">
+      <w:hyperlink r:id="rId59">
         <w:r>
           <w:rPr>
             <w:rStyle w:val="Hyperlink"/>
@@ -11291,8 +11260,8 @@
         </w:r>
       </w:hyperlink>
     </w:p>
-    <w:bookmarkEnd w:id="59"/>
-    <w:bookmarkStart w:id="61" w:name="ref-deeprose2012imagery"/>
+    <w:bookmarkEnd w:id="60"/>
+    <w:bookmarkStart w:id="62" w:name="ref-deeprose2012imagery"/>
     <w:p>
       <w:pPr>
         <w:pStyle w:val="Bibliography"/>
@@ -11329,7 +11298,7 @@
       <w:r>
         <w:t xml:space="preserve"> </w:t>
       </w:r>
-      <w:hyperlink r:id="rId60">
+      <w:hyperlink r:id="rId61">
         <w:r>
           <w:rPr>
             <w:rStyle w:val="Hyperlink"/>
@@ -11338,8 +11307,8 @@
         </w:r>
       </w:hyperlink>
     </w:p>
-    <w:bookmarkEnd w:id="61"/>
-    <w:bookmarkStart w:id="62" w:name="ref-dupertuys2026ukraine"/>
+    <w:bookmarkEnd w:id="62"/>
+    <w:bookmarkStart w:id="63" w:name="ref-dupertuys2026ukraine"/>
     <w:p>
       <w:pPr>
         <w:pStyle w:val="Bibliography"/>
@@ -11375,8 +11344,8 @@
         <w:t xml:space="preserve">.</w:t>
       </w:r>
     </w:p>
-    <w:bookmarkEnd w:id="62"/>
-    <w:bookmarkStart w:id="64" w:name="ref-ehlers2000cognitive"/>
+    <w:bookmarkEnd w:id="63"/>
+    <w:bookmarkStart w:id="65" w:name="ref-ehlers2000cognitive"/>
     <w:p>
       <w:pPr>
         <w:pStyle w:val="Bibliography"/>
@@ -11413,7 +11382,7 @@
       <w:r>
         <w:t xml:space="preserve"> </w:t>
       </w:r>
-      <w:hyperlink r:id="rId63">
+      <w:hyperlink r:id="rId64">
         <w:r>
           <w:rPr>
             <w:rStyle w:val="Hyperlink"/>
@@ -11422,8 +11391,8 @@
         </w:r>
       </w:hyperlink>
     </w:p>
-    <w:bookmarkEnd w:id="64"/>
-    <w:bookmarkStart w:id="66" w:name="ref-holmes2008inducing"/>
+    <w:bookmarkEnd w:id="65"/>
+    <w:bookmarkStart w:id="67" w:name="ref-holmes2008inducing"/>
     <w:p>
       <w:pPr>
         <w:pStyle w:val="Bibliography"/>
@@ -11460,7 +11429,7 @@
       <w:r>
         <w:t xml:space="preserve"> </w:t>
       </w:r>
-      <w:hyperlink r:id="rId65">
+      <w:hyperlink r:id="rId66">
         <w:r>
           <w:rPr>
             <w:rStyle w:val="Hyperlink"/>
@@ -11469,8 +11438,8 @@
         </w:r>
       </w:hyperlink>
     </w:p>
-    <w:bookmarkEnd w:id="66"/>
-    <w:bookmarkStart w:id="68" w:name="ref-holmes2004trauma"/>
+    <w:bookmarkEnd w:id="67"/>
+    <w:bookmarkStart w:id="69" w:name="ref-holmes2004trauma"/>
     <w:p>
       <w:pPr>
         <w:pStyle w:val="Bibliography"/>
@@ -11507,7 +11476,7 @@
       <w:r>
         <w:t xml:space="preserve"> </w:t>
       </w:r>
-      <w:hyperlink r:id="rId67">
+      <w:hyperlink r:id="rId68">
         <w:r>
           <w:rPr>
             <w:rStyle w:val="Hyperlink"/>
@@ -11516,8 +11485,8 @@
         </w:r>
       </w:hyperlink>
     </w:p>
-    <w:bookmarkEnd w:id="68"/>
-    <w:bookmarkStart w:id="70" w:name="ref-holmes2009can"/>
+    <w:bookmarkEnd w:id="69"/>
+    <w:bookmarkStart w:id="71" w:name="ref-holmes2009can"/>
     <w:p>
       <w:pPr>
         <w:pStyle w:val="Bibliography"/>
@@ -11566,7 +11535,7 @@
       <w:r>
         <w:t xml:space="preserve"> </w:t>
       </w:r>
-      <w:hyperlink r:id="rId69">
+      <w:hyperlink r:id="rId70">
         <w:r>
           <w:rPr>
             <w:rStyle w:val="Hyperlink"/>
@@ -11575,8 +11544,8 @@
         </w:r>
       </w:hyperlink>
     </w:p>
-    <w:bookmarkEnd w:id="70"/>
-    <w:bookmarkStart w:id="72" w:name="ref-holmes2010key"/>
+    <w:bookmarkEnd w:id="71"/>
+    <w:bookmarkStart w:id="73" w:name="ref-holmes2010key"/>
     <w:p>
       <w:pPr>
         <w:pStyle w:val="Bibliography"/>
@@ -11634,7 +11603,7 @@
       <w:r>
         <w:t xml:space="preserve"> </w:t>
       </w:r>
-      <w:hyperlink r:id="rId71">
+      <w:hyperlink r:id="rId72">
         <w:r>
           <w:rPr>
             <w:rStyle w:val="Hyperlink"/>
@@ -11643,8 +11612,8 @@
         </w:r>
       </w:hyperlink>
     </w:p>
-    <w:bookmarkEnd w:id="72"/>
-    <w:bookmarkStart w:id="74" w:name="ref-horsch2017reducing"/>
+    <w:bookmarkEnd w:id="73"/>
+    <w:bookmarkStart w:id="75" w:name="ref-horsch2017reducing"/>
     <w:p>
       <w:pPr>
         <w:pStyle w:val="Bibliography"/>
@@ -11681,7 +11650,7 @@
       <w:r>
         <w:t xml:space="preserve"> </w:t>
       </w:r>
-      <w:hyperlink r:id="rId73">
+      <w:hyperlink r:id="rId74">
         <w:r>
           <w:rPr>
             <w:rStyle w:val="Hyperlink"/>
@@ -11690,8 +11659,8 @@
         </w:r>
       </w:hyperlink>
     </w:p>
-    <w:bookmarkEnd w:id="74"/>
-    <w:bookmarkStart w:id="76" w:name="ref-howard2002distributed"/>
+    <w:bookmarkEnd w:id="75"/>
+    <w:bookmarkStart w:id="77" w:name="ref-howard2002distributed"/>
     <w:p>
       <w:pPr>
         <w:pStyle w:val="Bibliography"/>
@@ -11728,7 +11697,7 @@
       <w:r>
         <w:t xml:space="preserve"> </w:t>
       </w:r>
-      <w:hyperlink r:id="rId75">
+      <w:hyperlink r:id="rId76">
         <w:r>
           <w:rPr>
             <w:rStyle w:val="Hyperlink"/>
@@ -11737,8 +11706,8 @@
         </w:r>
       </w:hyperlink>
     </w:p>
-    <w:bookmarkEnd w:id="76"/>
-    <w:bookmarkStart w:id="77" w:name="ref-howard2008persistence"/>
+    <w:bookmarkEnd w:id="77"/>
+    <w:bookmarkStart w:id="78" w:name="ref-howard2008persistence"/>
     <w:p>
       <w:pPr>
         <w:pStyle w:val="Bibliography"/>
@@ -11773,8 +11742,8 @@
         <w:t xml:space="preserve">(1), 58–63.</w:t>
       </w:r>
     </w:p>
-    <w:bookmarkEnd w:id="77"/>
-    <w:bookmarkStart w:id="79" w:name="ref-iyadurai2018preventing"/>
+    <w:bookmarkEnd w:id="78"/>
+    <w:bookmarkStart w:id="80" w:name="ref-iyadurai2018preventing"/>
     <w:p>
       <w:pPr>
         <w:pStyle w:val="Bibliography"/>
@@ -11823,7 +11792,7 @@
       <w:r>
         <w:t xml:space="preserve"> </w:t>
       </w:r>
-      <w:hyperlink r:id="rId78">
+      <w:hyperlink r:id="rId79">
         <w:r>
           <w:rPr>
             <w:rStyle w:val="Hyperlink"/>
@@ -11832,8 +11801,8 @@
         </w:r>
       </w:hyperlink>
     </w:p>
-    <w:bookmarkEnd w:id="79"/>
-    <w:bookmarkStart w:id="81" w:name="ref-iyadurai2019intrusive"/>
+    <w:bookmarkEnd w:id="80"/>
+    <w:bookmarkStart w:id="82" w:name="ref-iyadurai2019intrusive"/>
     <w:p>
       <w:pPr>
         <w:pStyle w:val="Bibliography"/>
@@ -11870,7 +11839,7 @@
       <w:r>
         <w:t xml:space="preserve"> </w:t>
       </w:r>
-      <w:hyperlink r:id="rId80">
+      <w:hyperlink r:id="rId81">
         <w:r>
           <w:rPr>
             <w:rStyle w:val="Hyperlink"/>
@@ -11879,8 +11848,8 @@
         </w:r>
       </w:hyperlink>
     </w:p>
-    <w:bookmarkEnd w:id="81"/>
-    <w:bookmarkStart w:id="83" w:name="ref-james2015computer"/>
+    <w:bookmarkEnd w:id="82"/>
+    <w:bookmarkStart w:id="84" w:name="ref-james2015computer"/>
     <w:p>
       <w:pPr>
         <w:pStyle w:val="Bibliography"/>
@@ -11917,7 +11886,7 @@
       <w:r>
         <w:t xml:space="preserve"> </w:t>
       </w:r>
-      <w:hyperlink r:id="rId82">
+      <w:hyperlink r:id="rId83">
         <w:r>
           <w:rPr>
             <w:rStyle w:val="Hyperlink"/>
@@ -11926,8 +11895,8 @@
         </w:r>
       </w:hyperlink>
     </w:p>
-    <w:bookmarkEnd w:id="83"/>
-    <w:bookmarkStart w:id="85" w:name="ref-james2016trauma"/>
+    <w:bookmarkEnd w:id="84"/>
+    <w:bookmarkStart w:id="86" w:name="ref-james2016trauma"/>
     <w:p>
       <w:pPr>
         <w:pStyle w:val="Bibliography"/>
@@ -11964,7 +11933,7 @@
       <w:r>
         <w:t xml:space="preserve"> </w:t>
       </w:r>
-      <w:hyperlink r:id="rId84">
+      <w:hyperlink r:id="rId85">
         <w:r>
           <w:rPr>
             <w:rStyle w:val="Hyperlink"/>
@@ -11973,8 +11942,8 @@
         </w:r>
       </w:hyperlink>
     </w:p>
-    <w:bookmarkEnd w:id="85"/>
-    <w:bookmarkStart w:id="86" w:name="ref-kahana1996associative"/>
+    <w:bookmarkEnd w:id="86"/>
+    <w:bookmarkStart w:id="87" w:name="ref-kahana1996associative"/>
     <w:p>
       <w:pPr>
         <w:pStyle w:val="Bibliography"/>
@@ -12009,8 +11978,8 @@
         <w:t xml:space="preserve">(1), 103–109.</w:t>
       </w:r>
     </w:p>
-    <w:bookmarkEnd w:id="86"/>
-    <w:bookmarkStart w:id="88" w:name="ref-kanstrup2021single"/>
+    <w:bookmarkEnd w:id="87"/>
+    <w:bookmarkStart w:id="89" w:name="ref-kanstrup2021single"/>
     <w:p>
       <w:pPr>
         <w:pStyle w:val="Bibliography"/>
@@ -12047,7 +12016,7 @@
       <w:r>
         <w:t xml:space="preserve"> </w:t>
       </w:r>
-      <w:hyperlink r:id="rId87">
+      <w:hyperlink r:id="rId88">
         <w:r>
           <w:rPr>
             <w:rStyle w:val="Hyperlink"/>
@@ -12056,8 +12025,8 @@
         </w:r>
       </w:hyperlink>
     </w:p>
-    <w:bookmarkEnd w:id="88"/>
-    <w:bookmarkStart w:id="90" w:name="ref-kessler2020visuospatial"/>
+    <w:bookmarkEnd w:id="89"/>
+    <w:bookmarkStart w:id="91" w:name="ref-kessler2020visuospatial"/>
     <w:p>
       <w:pPr>
         <w:pStyle w:val="Bibliography"/>
@@ -12094,7 +12063,7 @@
       <w:r>
         <w:t xml:space="preserve"> </w:t>
       </w:r>
-      <w:hyperlink r:id="rId89">
+      <w:hyperlink r:id="rId90">
         <w:r>
           <w:rPr>
             <w:rStyle w:val="Hyperlink"/>
@@ -12103,8 +12072,8 @@
         </w:r>
       </w:hyperlink>
     </w:p>
-    <w:bookmarkEnd w:id="90"/>
-    <w:bookmarkStart w:id="92" w:name="ref-kindt2009beyond"/>
+    <w:bookmarkEnd w:id="91"/>
+    <w:bookmarkStart w:id="93" w:name="ref-kindt2009beyond"/>
     <w:p>
       <w:pPr>
         <w:pStyle w:val="Bibliography"/>
@@ -12141,7 +12110,7 @@
       <w:r>
         <w:t xml:space="preserve"> </w:t>
       </w:r>
-      <w:hyperlink r:id="rId91">
+      <w:hyperlink r:id="rId92">
         <w:r>
           <w:rPr>
             <w:rStyle w:val="Hyperlink"/>
@@ -12150,8 +12119,8 @@
         </w:r>
       </w:hyperlink>
     </w:p>
-    <w:bookmarkEnd w:id="92"/>
-    <w:bookmarkStart w:id="94" w:name="ref-krans2009intrusive"/>
+    <w:bookmarkEnd w:id="93"/>
+    <w:bookmarkStart w:id="95" w:name="ref-krans2009intrusive"/>
     <w:p>
       <w:pPr>
         <w:pStyle w:val="Bibliography"/>
@@ -12188,7 +12157,7 @@
       <w:r>
         <w:t xml:space="preserve"> </w:t>
       </w:r>
-      <w:hyperlink r:id="rId93">
+      <w:hyperlink r:id="rId94">
         <w:r>
           <w:rPr>
             <w:rStyle w:val="Hyperlink"/>
@@ -12197,8 +12166,8 @@
         </w:r>
       </w:hyperlink>
     </w:p>
-    <w:bookmarkEnd w:id="94"/>
-    <w:bookmarkStart w:id="96" w:name="ref-lau2019intrusive"/>
+    <w:bookmarkEnd w:id="95"/>
+    <w:bookmarkStart w:id="97" w:name="ref-lau2019intrusive"/>
     <w:p>
       <w:pPr>
         <w:pStyle w:val="Bibliography"/>
@@ -12235,7 +12204,7 @@
       <w:r>
         <w:t xml:space="preserve"> </w:t>
       </w:r>
-      <w:hyperlink r:id="rId95">
+      <w:hyperlink r:id="rId96">
         <w:r>
           <w:rPr>
             <w:rStyle w:val="Hyperlink"/>
@@ -12244,8 +12213,8 @@
         </w:r>
       </w:hyperlink>
     </w:p>
-    <w:bookmarkEnd w:id="96"/>
-    <w:bookmarkStart w:id="98" w:name="ref-lohnas2015expanding"/>
+    <w:bookmarkEnd w:id="97"/>
+    <w:bookmarkStart w:id="99" w:name="ref-lohnas2015expanding"/>
     <w:p>
       <w:pPr>
         <w:pStyle w:val="Bibliography"/>
@@ -12282,7 +12251,7 @@
       <w:r>
         <w:t xml:space="preserve"> </w:t>
       </w:r>
-      <w:hyperlink r:id="rId97">
+      <w:hyperlink r:id="rId98">
         <w:r>
           <w:rPr>
             <w:rStyle w:val="Hyperlink"/>
@@ -12290,42 +12259,6 @@
           <w:t xml:space="preserve">https://doi.org/10.1037/a0039036</w:t>
         </w:r>
       </w:hyperlink>
-    </w:p>
-    <w:bookmarkEnd w:id="98"/>
-    <w:bookmarkStart w:id="99" w:name="ref-mensink1989model"/>
-    <w:p>
-      <w:pPr>
-        <w:pStyle w:val="Bibliography"/>
-      </w:pPr>
-      <w:r>
-        <w:t xml:space="preserve">Mensink, G.-J. M., &amp; Raaijmakers, J. G. (1989). A model for contextual fluctuation.</w:t>
-      </w:r>
-      <w:r>
-        <w:t xml:space="preserve"> </w:t>
-      </w:r>
-      <w:r>
-        <w:rPr>
-          <w:i/>
-          <w:iCs/>
-        </w:rPr>
-        <w:t xml:space="preserve">Journal of Mathematical Psychology</w:t>
-      </w:r>
-      <w:r>
-        <w:t xml:space="preserve">,</w:t>
-      </w:r>
-      <w:r>
-        <w:t xml:space="preserve"> </w:t>
-      </w:r>
-      <w:r>
-        <w:rPr>
-          <w:i/>
-          <w:iCs/>
-        </w:rPr>
-        <w:t xml:space="preserve">33</w:t>
-      </w:r>
-      <w:r>
-        <w:t xml:space="preserve">(2), 172–186.</w:t>
-      </w:r>
     </w:p>
     <w:bookmarkEnd w:id="99"/>
     <w:bookmarkStart w:id="101" w:name="ref-polyn2009context"/>

</xml_diff>

<commit_message>
improve simulation specification ahead of transplant
</commit_message>
<xml_diff>
--- a/docs/index.docx
+++ b/docs/index.docx
@@ -4537,7 +4537,7 @@
         <w:t xml:space="preserve"> </w:t>
       </w:r>
       <w:r>
-        <w:t xml:space="preserve">During retrieval, current context cues encoded items through</w:t>
+        <w:t xml:space="preserve">During context-guided retrieval, current context cues encoded items through</w:t>
       </w:r>
       <w:r>
         <w:t xml:space="preserve"> </w:t>
@@ -8117,6 +8117,18 @@
       <w:r>
         <w:t xml:space="preserve">These plots are diagnostic outputs from the interference-strength sweep, not stand-alone evidence for the full intrusion-voluntary-memory dissociation.</w:t>
       </w:r>
+      <w:r>
+        <w:t xml:space="preserve"> </w:t>
+      </w:r>
+      <w:r>
+        <w:t xml:space="preserve">The section scaffold below records what each simulation must establish before the final result text is written.</w:t>
+      </w:r>
+      <w:r>
+        <w:t xml:space="preserve"> </w:t>
+      </w:r>
+      <w:r>
+        <w:t xml:space="preserve">Each subsection specifies the core contrast, the primary readouts, and the main design decision still open at this stage.</w:t>
+      </w:r>
     </w:p>
     <w:bookmarkStart w:id="42" w:name="fig-interference-sweep-spc"/>
     <w:p>
@@ -8215,13 +8227,19 @@
         <w:pStyle w:val="FirstParagraph"/>
       </w:pPr>
       <w:r>
-        <w:t xml:space="preserve">Premise: The basic selective-interference result is a 2 x 2 contrast between interference condition and retrieval mode.</w:t>
-      </w:r>
-      <w:r>
-        <w:t xml:space="preserve"> </w:t>
-      </w:r>
-      <w:r>
-        <w:t xml:space="preserve">The section asks whether the same stored film episode and the same post-film interference manipulation can produce larger impairment in intrusion-like retrieval than in deliberate recall.</w:t>
+        <w:t xml:space="preserve">Premise: The basic selective-interference result is a 2 x 2 contrast between task competition and retrieval mode.</w:t>
+      </w:r>
+      <w:r>
+        <w:t xml:space="preserve"> </w:t>
+      </w:r>
+      <w:r>
+        <w:t xml:space="preserve">The section should compare weak or absent task competition with strong task competition under unguided retrieval and deliberate recall.</w:t>
+      </w:r>
+      <w:r>
+        <w:t xml:space="preserve"> </w:t>
+      </w:r>
+      <w:r>
+        <w:t xml:space="preserve">The core demonstration is that the same stored film episode and the same post-film task manipulation produce larger film-item impairment under unguided retrieval than under deliberate recall.</w:t>
       </w:r>
     </w:p>
     <w:p>
@@ -8229,6 +8247,26 @@
         <w:pStyle w:val="BodyText"/>
       </w:pPr>
       <w:r>
+        <w:t xml:space="preserve">Primary readouts: The main figure should show phase-resolved recall so the reader can see where retrieval probability is redistributed across film, task, and filler phases.</w:t>
+      </w:r>
+      <w:r>
+        <w:t xml:space="preserve"> </w:t>
+      </w:r>
+      <w:r>
+        <w:t xml:space="preserve">A compact summary should also show film-item access and impairment from baseline for each retrieval mode.</w:t>
+      </w:r>
+      <w:r>
+        <w:t xml:space="preserve"> </w:t>
+      </w:r>
+      <w:r>
+        <w:t xml:space="preserve">Task-competitor recall should be reported or visible enough to show that lost film access is competition-driven.</w:t>
+      </w:r>
+    </w:p>
+    <w:p>
+      <w:pPr>
+        <w:pStyle w:val="BodyText"/>
+      </w:pPr>
+      <w:r>
         <w:t xml:space="preserve">Intended text take-away: This section establishes the core sufficiency result.</w:t>
       </w:r>
       <w:r>
@@ -8242,6 +8280,20 @@
       </w:r>
       <w:r>
         <w:t xml:space="preserve">Deliberate recall may still be impaired; the claim is relative protection, not immunity.</w:t>
+      </w:r>
+    </w:p>
+    <w:p>
+      <w:pPr>
+        <w:pStyle w:val="BodyText"/>
+      </w:pPr>
+      <w:r>
+        <w:t xml:space="preserve">Open specification: The deliberate-recall settings used here need to be fixed before this section is written as a result.</w:t>
+      </w:r>
+      <w:r>
+        <w:t xml:space="preserve"> </w:t>
+      </w:r>
+      <w:r>
+        <w:t xml:space="preserve">Those settings should be strong enough to create a retrieval-mode contrast but simple enough that Simulation 2 can still isolate the separate control mechanisms.</w:t>
       </w:r>
     </w:p>
     <w:bookmarkEnd w:id="43"/>
@@ -8267,12 +8319,57 @@
       <w:r>
         <w:t xml:space="preserve">Its relative sparing depends on control operations that make retrieval more film-directed.</w:t>
       </w:r>
+      <w:r>
+        <w:t xml:space="preserve"> </w:t>
+      </w:r>
+      <w:r>
+        <w:t xml:space="preserve">This section should separate the contributions of film-directed start/context cueing, sharper selection through</w:t>
+      </w:r>
+      <w:r>
+        <w:t xml:space="preserve"> </w:t>
+      </w:r>
+      <m:oMath>
+        <m:r>
+          <m:t>τ</m:t>
+        </m:r>
+      </m:oMath>
+      <w:r>
+        <w:t xml:space="preserve">, and target-monitoring or rejected-recall updating through</w:t>
+      </w:r>
+      <w:r>
+        <w:t xml:space="preserve"> </w:t>
+      </w:r>
+      <m:oMath>
+        <m:r>
+          <m:t>κ</m:t>
+        </m:r>
+      </m:oMath>
+      <w:r>
+        <w:t xml:space="preserve"> </w:t>
+      </w:r>
+      <w:r>
+        <w:t xml:space="preserve">if that mechanism remains in the simulation package.</w:t>
+      </w:r>
     </w:p>
     <w:p>
       <w:pPr>
         <w:pStyle w:val="BodyText"/>
       </w:pPr>
       <w:r>
+        <w:t xml:space="preserve">Primary readouts: The figure should show how each control lever changes film-item access and the phase-resolved organization of recall under a fixed task-competition setting.</w:t>
+      </w:r>
+      <w:r>
+        <w:t xml:space="preserve"> </w:t>
+      </w:r>
+      <w:r>
+        <w:t xml:space="preserve">The most useful contrast should include total film recall, task-competitor retrieval, and how closely recall remains tied to the film phase.</w:t>
+      </w:r>
+    </w:p>
+    <w:p>
+      <w:pPr>
+        <w:pStyle w:val="BodyText"/>
+      </w:pPr>
+      <w:r>
         <w:t xml:space="preserve">Intended text take-away: This section earns the</w:t>
       </w:r>
       <w:r>
@@ -8297,7 +8394,35 @@
         <w:t xml:space="preserve"> </w:t>
       </w:r>
       <w:r>
-        <w:t xml:space="preserve">Weakening these control operations should make deliberate recall resemble intrusion-like retrieval more closely.</w:t>
+        <w:t xml:space="preserve">Weakening these control operations should make deliberate recall resemble unguided retrieval more closely.</w:t>
+      </w:r>
+    </w:p>
+    <w:p>
+      <w:pPr>
+        <w:pStyle w:val="BodyText"/>
+      </w:pPr>
+      <w:r>
+        <w:t xml:space="preserve">Open specification: Decide whether target-monitoring through</w:t>
+      </w:r>
+      <w:r>
+        <w:t xml:space="preserve"> </w:t>
+      </w:r>
+      <m:oMath>
+        <m:r>
+          <m:t>κ</m:t>
+        </m:r>
+      </m:oMath>
+      <w:r>
+        <w:t xml:space="preserve"> </w:t>
+      </w:r>
+      <w:r>
+        <w:t xml:space="preserve">is a core control mechanism or a sensitivity analysis.</w:t>
+      </w:r>
+      <w:r>
+        <w:t xml:space="preserve"> </w:t>
+      </w:r>
+      <w:r>
+        <w:t xml:space="preserve">The introduction currently emphasizes film-directed cueing and sharper selection more strongly than rejected-recall updating.</w:t>
       </w:r>
     </w:p>
     <w:bookmarkEnd w:id="44"/>
@@ -8323,12 +8448,32 @@
       <w:r>
         <w:t xml:space="preserve">This section asks what makes a task Tetris-like in model terms.</w:t>
       </w:r>
+      <w:r>
+        <w:t xml:space="preserve"> </w:t>
+      </w:r>
+      <w:r>
+        <w:t xml:space="preserve">The design should separate task competitor strength from contextual overlap rather than letting one sweep carry both interpretations.</w:t>
+      </w:r>
     </w:p>
     <w:p>
       <w:pPr>
         <w:pStyle w:val="BodyText"/>
       </w:pPr>
       <w:r>
+        <w:t xml:space="preserve">Primary readouts: The figure should cross or juxtapose a task-strength manipulation with an overlap manipulation and show both film-item access and task-competitor retrieval.</w:t>
+      </w:r>
+      <w:r>
+        <w:t xml:space="preserve"> </w:t>
+      </w:r>
+      <w:r>
+        <w:t xml:space="preserve">Phase-resolved recall remains useful here because the model’s explanation depends on task items entering retrieval alongside film items.</w:t>
+      </w:r>
+    </w:p>
+    <w:p>
+      <w:pPr>
+        <w:pStyle w:val="BodyText"/>
+      </w:pPr>
+      <w:r>
         <w:t xml:space="preserve">Intended text take-away: This section explains what makes interference effective.</w:t>
       </w:r>
       <w:r>
@@ -8341,13 +8486,33 @@
         <w:t xml:space="preserve"> </w:t>
       </w:r>
       <w:r>
-        <w:t xml:space="preserve">Competitor strength matters because competitors are retrievable from film-related context.</w:t>
-      </w:r>
-      <w:r>
-        <w:t xml:space="preserve"> </w:t>
-      </w:r>
-      <w:r>
-        <w:t xml:space="preserve">The affective variant sharpens the boundary condition: stronger affective film encoding can increase baseline film retrieval and reduce vulnerability to mismatched task competitors, whereas affective matching can make strong task items more effective competitors.</w:t>
+        <w:t xml:space="preserve">Competitor strength determines whether cued task items can win retrieval competitions.</w:t>
+      </w:r>
+      <w:r>
+        <w:t xml:space="preserve"> </w:t>
+      </w:r>
+      <w:r>
+        <w:t xml:space="preserve">Contextual overlap determines whether task competitors are cued alongside film items before their strength can impair film retrieval.</w:t>
+      </w:r>
+      <w:r>
+        <w:t xml:space="preserve"> </w:t>
+      </w:r>
+      <w:r>
+        <w:t xml:space="preserve">Affective matching can be used as a sensitivity extension if it is run as a specific manipulation, but it should not become the main explanation unless the simulations make it central.</w:t>
+      </w:r>
+    </w:p>
+    <w:p>
+      <w:pPr>
+        <w:pStyle w:val="BodyText"/>
+      </w:pPr>
+      <w:r>
+        <w:t xml:space="preserve">Open specification: Choose the primary operationalization of contextual overlap.</w:t>
+      </w:r>
+      <w:r>
+        <w:t xml:space="preserve"> </w:t>
+      </w:r>
+      <w:r>
+        <w:t xml:space="preserve">Candidates include task-phase drift, break/filler drift, reminder strength, and affective matching, but the section needs one main contrast and any others should be clearly secondary.</w:t>
       </w:r>
     </w:p>
     <w:bookmarkEnd w:id="45"/>
@@ -8371,7 +8536,7 @@
         <w:t xml:space="preserve"> </w:t>
       </w:r>
       <w:r>
-        <w:t xml:space="preserve">A reminder matters because it reinstates film context before competitor encoding.</w:t>
+        <w:t xml:space="preserve">A reminder reinstates film context before competitor encoding by applying sequential film-item cues without new learning.</w:t>
       </w:r>
     </w:p>
     <w:p>
@@ -8379,6 +8544,20 @@
         <w:pStyle w:val="BodyText"/>
       </w:pPr>
       <w:r>
+        <w:t xml:space="preserve">Primary readouts: The figure should show how weak versus strong reminder reinstatement changes phase-resolved recall and film-item access after a fixed task phase.</w:t>
+      </w:r>
+      <w:r>
+        <w:t xml:space="preserve"> </w:t>
+      </w:r>
+      <w:r>
+        <w:t xml:space="preserve">If delay or filler length is varied, the figure should make clear whether the effect comes from reinstatement strength, subsequent drift, or their combination.</w:t>
+      </w:r>
+    </w:p>
+    <w:p>
+      <w:pPr>
+        <w:pStyle w:val="BodyText"/>
+      </w:pPr>
+      <w:r>
         <w:t xml:space="preserve">Intended text take-away: This section connects the model to post-reminder interventions.</w:t>
       </w:r>
       <w:r>
@@ -8392,6 +8571,14 @@
       </w:r>
       <w:r>
         <w:t xml:space="preserve">It restores the contextual condition required for later competitor encoding to affect film-item retrieval.</w:t>
+      </w:r>
+    </w:p>
+    <w:p>
+      <w:pPr>
+        <w:pStyle w:val="BodyText"/>
+      </w:pPr>
+      <w:r>
+        <w:t xml:space="preserve">Open specification: Decide whether the main comparison is zero/weak reminder reinstatement versus strong reminder reinstatement, a reminder-strength sweep, a delay/drift sweep, or a compact factorial combination.</w:t>
       </w:r>
     </w:p>
     <w:bookmarkEnd w:id="46"/>
@@ -8417,12 +8604,38 @@
       <w:r>
         <w:t xml:space="preserve">This section maps the model’s retrieval-control mechanisms onto variation across recall-like empirical measures.</w:t>
       </w:r>
+      <w:r>
+        <w:t xml:space="preserve"> </w:t>
+      </w:r>
+      <w:r>
+        <w:t xml:space="preserve">The section should only become a simulation result if each test format is assigned a concrete retrieval setting.</w:t>
+      </w:r>
+      <w:r>
+        <w:t xml:space="preserve"> </w:t>
+      </w:r>
+      <w:r>
+        <w:t xml:space="preserve">Candidate settings include unguided retrieval from ongoing context, monitoring with film-related cues, free recall with film-directed start cueing, and cued recall with stronger external support.</w:t>
+      </w:r>
     </w:p>
     <w:p>
       <w:pPr>
         <w:pStyle w:val="BodyText"/>
       </w:pPr>
       <w:r>
+        <w:t xml:space="preserve">Primary readouts: The figure should show a graded vulnerability profile across retrieval settings under the same stored associations.</w:t>
+      </w:r>
+      <w:r>
+        <w:t xml:space="preserve"> </w:t>
+      </w:r>
+      <w:r>
+        <w:t xml:space="preserve">The useful result is a continuum of film-item impairment across retrieval settings.</w:t>
+      </w:r>
+    </w:p>
+    <w:p>
+      <w:pPr>
+        <w:pStyle w:val="BodyText"/>
+      </w:pPr>
+      <w:r>
         <w:t xml:space="preserve">Intended text take-away: This section interprets heterogeneity across empirical paradigms without treating intrusion and voluntary memory as fixed computational kinds.</w:t>
       </w:r>
       <w:r>
@@ -8430,6 +8643,20 @@
       </w:r>
       <w:r>
         <w:t xml:space="preserve">The model predicts a continuum of vulnerability across recall-like tests depending on how much the task supports film-directed retrieval.</w:t>
+      </w:r>
+    </w:p>
+    <w:p>
+      <w:pPr>
+        <w:pStyle w:val="BodyText"/>
+      </w:pPr>
+      <w:r>
+        <w:t xml:space="preserve">Open specification: The mapping from empirical test format to model setting is the main unresolved piece.</w:t>
+      </w:r>
+      <w:r>
+        <w:t xml:space="preserve"> </w:t>
+      </w:r>
+      <w:r>
+        <w:t xml:space="preserve">If the mapping remains qualitative, this material belongs in the discussion rather than as a numbered simulation.</w:t>
       </w:r>
     </w:p>
     <w:bookmarkEnd w:id="47"/>
@@ -8455,12 +8682,32 @@
       <w:r>
         <w:t xml:space="preserve">This section preserves the useful part of the old recognition result without treating probe-driven access as categorically protected.</w:t>
       </w:r>
+      <w:r>
+        <w:t xml:space="preserve"> </w:t>
+      </w:r>
+      <w:r>
+        <w:t xml:space="preserve">The section should remain separate only if the simulation directly implements supplied-film-item cueing and contrasts it with broad context-to-feature search.</w:t>
+      </w:r>
     </w:p>
     <w:p>
       <w:pPr>
         <w:pStyle w:val="BodyText"/>
       </w:pPr>
       <w:r>
+        <w:t xml:space="preserve">Primary readouts: The figure should show that supplied film items can reinstate associated context and reduce exposure to task competitors under otherwise matched stored associations.</w:t>
+      </w:r>
+      <w:r>
+        <w:t xml:space="preserve"> </w:t>
+      </w:r>
+      <w:r>
+        <w:t xml:space="preserve">It should avoid implying a full recognition decision model unless such a mechanism is added.</w:t>
+      </w:r>
+    </w:p>
+    <w:p>
+      <w:pPr>
+        <w:pStyle w:val="BodyText"/>
+      </w:pPr>
+      <w:r>
         <w:t xml:space="preserve">Intended text take-away: This section handles tests that supply a film item and recognition-like measures as a probe-driven access case.</w:t>
       </w:r>
       <w:r>
@@ -8468,6 +8715,14 @@
       </w:r>
       <w:r>
         <w:t xml:space="preserve">The claim is that probe-driven access reduces exposure to contextual competition, not that recognition escapes the mechanism in every design or that all voluntary memory has the same protection.</w:t>
+      </w:r>
+    </w:p>
+    <w:p>
+      <w:pPr>
+        <w:pStyle w:val="BodyText"/>
+      </w:pPr>
+      <w:r>
+        <w:t xml:space="preserve">Open specification: Decide whether this section earns its own simulation or should be folded into Simulation 5 as one point on the retrieval-support continuum.</w:t>
       </w:r>
     </w:p>
     <w:bookmarkEnd w:id="48"/>

</xml_diff>

<commit_message>
model spec and simulation overview locked in
</commit_message>
<xml_diff>
--- a/docs/index.docx
+++ b/docs/index.docx
@@ -1935,7 +1935,7 @@
       </w:r>
     </w:p>
     <w:bookmarkEnd w:id="29"/>
-    <w:bookmarkStart w:id="56" w:name="model-specification"/>
+    <w:bookmarkStart w:id="54" w:name="model-specification"/>
     <w:p>
       <w:pPr>
         <w:pStyle w:val="Heading1"/>
@@ -5671,1182 +5671,7 @@
       </w:r>
     </w:p>
     <w:bookmarkEnd w:id="45"/>
-    <w:bookmarkStart w:id="47" w:name="paradigm-phases-and-settings"/>
-    <w:p>
-      <w:pPr>
-        <w:pStyle w:val="Heading2"/>
-      </w:pPr>
-      <w:r>
-        <w:t xml:space="preserve">Paradigm Phases and Settings</w:t>
-      </w:r>
-    </w:p>
-    <w:p>
-      <w:pPr>
-        <w:pStyle w:val="FirstParagraph"/>
-      </w:pPr>
-      <w:r>
-        <w:t xml:space="preserve">The selective-interference paradigm configures the drift term in</w:t>
-      </w:r>
-      <w:r>
-        <w:t xml:space="preserve"> </w:t>
-      </w:r>
-      <w:hyperlink w:anchor="eq-context-update">
-        <w:r>
-          <w:rPr>
-            <w:rStyle w:val="Hyperlink"/>
-          </w:rPr>
-          <w:t xml:space="preserve">Equation 4</w:t>
-        </w:r>
-      </w:hyperlink>
-      <w:r>
-        <w:t xml:space="preserve">, the learning scale in</w:t>
-      </w:r>
-      <w:r>
-        <w:t xml:space="preserve"> </w:t>
-      </w:r>
-      <w:hyperlink w:anchor="eq-mcf-learning">
-        <w:r>
-          <w:rPr>
-            <w:rStyle w:val="Hyperlink"/>
-          </w:rPr>
-          <w:t xml:space="preserve">Equation 8</w:t>
-        </w:r>
-      </w:hyperlink>
-      <w:r>
-        <w:t xml:space="preserve">, and the retrieval-control settings applied to the sampling process.</w:t>
-      </w:r>
-      <w:r>
-        <w:t xml:space="preserve"> </w:t>
-      </w:r>
-      <w:hyperlink w:anchor="tbl-paradigm-settings">
-        <w:r>
-          <w:rPr>
-            <w:rStyle w:val="Hyperlink"/>
-          </w:rPr>
-          <w:t xml:space="preserve">Table 2</w:t>
-        </w:r>
-      </w:hyperlink>
-      <w:r>
-        <w:t xml:space="preserve"> </w:t>
-      </w:r>
-      <w:r>
-        <w:t xml:space="preserve">summarizes the settings used by the simulations.</w:t>
-      </w:r>
-    </w:p>
-    <w:bookmarkStart w:id="46" w:name="tbl-paradigm-settings"/>
-    <w:p>
-      <w:pPr>
-        <w:pStyle w:val="FigureTitle"/>
-      </w:pPr>
-      <w:r>
-        <w:t xml:space="preserve">Table 2</w:t>
-      </w:r>
-    </w:p>
-    <w:p>
-      <w:pPr>
-        <w:pStyle w:val="Caption"/>
-      </w:pPr>
-      <w:r>
-        <w:t xml:space="preserve">Paradigm phase and retrieval settings.</w:t>
-      </w:r>
-      <w:r>
-        <w:t xml:space="preserve"> </w:t>
-      </w:r>
-      <w:r>
-        <w:t xml:space="preserve">Drift scales multiply their base rates and are clipped to</w:t>
-      </w:r>
-      <w:r>
-        <w:t xml:space="preserve"> </w:t>
-      </w:r>
-      <m:oMath>
-        <m:d>
-          <m:dPr>
-            <m:begChr m:val="["/>
-            <m:sepChr m:val=""/>
-            <m:endChr m:val="]"/>
-            <m:grow/>
-          </m:dPr>
-          <m:e>
-            <m:r>
-              <m:t>0</m:t>
-            </m:r>
-            <m:r>
-              <m:rPr>
-                <m:sty m:val="p"/>
-              </m:rPr>
-              <m:t>,</m:t>
-            </m:r>
-            <m:r>
-              <m:t>1</m:t>
-            </m:r>
-          </m:e>
-        </m:d>
-      </m:oMath>
-      <w:r>
-        <w:t xml:space="preserve">.</w:t>
-      </w:r>
-    </w:p>
-    <w:tbl>
-      <w:tblPr>
-        <w:tblStyle w:val="Table"/>
-        <w:tblW w:type="pct" w:w="5000"/>
-        <w:tblLayout w:type="fixed"/>
-        <w:tblLook w:firstRow="1" w:lastRow="0" w:firstColumn="0" w:lastColumn="0" w:noHBand="0" w:noVBand="0" w:val="0020"/>
-      </w:tblPr>
-      <w:tblGrid>
-        <w:gridCol w:w="1980"/>
-        <w:gridCol w:w="1980"/>
-        <w:gridCol w:w="1980"/>
-        <w:gridCol w:w="1980"/>
-      </w:tblGrid>
-      <w:tr>
-        <w:trPr>
-          <w:tblHeader w:val="on"/>
-        </w:trPr>
-        <w:tc>
-          <w:tcPr/>
-          <w:p>
-            <w:pPr>
-              <w:pStyle w:val="Compact"/>
-            </w:pPr>
-            <w:r>
-              <w:t xml:space="preserve">Segment</w:t>
-            </w:r>
-          </w:p>
-        </w:tc>
-        <w:tc>
-          <w:tcPr/>
-          <w:p>
-            <w:pPr>
-              <w:pStyle w:val="Compact"/>
-            </w:pPr>
-            <w:r>
-              <w:t xml:space="preserve">Operation</w:t>
-            </w:r>
-          </w:p>
-        </w:tc>
-        <w:tc>
-          <w:tcPr/>
-          <w:p>
-            <w:pPr>
-              <w:pStyle w:val="Compact"/>
-            </w:pPr>
-            <w:r>
-              <w:t xml:space="preserve">Settings</w:t>
-            </w:r>
-          </w:p>
-        </w:tc>
-        <w:tc>
-          <w:tcPr/>
-          <w:p>
-            <w:pPr>
-              <w:pStyle w:val="Compact"/>
-            </w:pPr>
-            <w:r>
-              <w:t xml:space="preserve">Paradigm role</w:t>
-            </w:r>
-          </w:p>
-        </w:tc>
-      </w:tr>
-      <w:tr>
-        <w:tc>
-          <w:tcPr/>
-          <w:p>
-            <w:pPr>
-              <w:pStyle w:val="Compact"/>
-            </w:pPr>
-            <w:r>
-              <w:t xml:space="preserve">Film</w:t>
-            </w:r>
-          </w:p>
-        </w:tc>
-        <w:tc>
-          <w:tcPr/>
-          <w:p>
-            <w:pPr>
-              <w:pStyle w:val="Compact"/>
-            </w:pPr>
-            <w:r>
-              <w:t xml:space="preserve">Encode film items</w:t>
-            </w:r>
-          </w:p>
-        </w:tc>
-        <w:tc>
-          <w:tcPr/>
-          <w:p>
-            <w:pPr>
-              <w:pStyle w:val="Compact"/>
-            </w:pPr>
-            <m:oMath>
-              <m:r>
-                <m:t>β</m:t>
-              </m:r>
-              <m:r>
-                <m:rPr>
-                  <m:sty m:val="p"/>
-                </m:rPr>
-                <m:t>=</m:t>
-              </m:r>
-              <m:sSub>
-                <m:e>
-                  <m:r>
-                    <m:t>β</m:t>
-                  </m:r>
-                </m:e>
-                <m:sub>
-                  <m:r>
-                    <m:t>e</m:t>
-                  </m:r>
-                  <m:r>
-                    <m:t>n</m:t>
-                  </m:r>
-                  <m:r>
-                    <m:t>c</m:t>
-                  </m:r>
-                </m:sub>
-              </m:sSub>
-            </m:oMath>
-            <w:r>
-              <w:t xml:space="preserve">;</w:t>
-            </w:r>
-            <w:r>
-              <w:t xml:space="preserve"> </w:t>
-            </w:r>
-            <m:oMath>
-              <m:r>
-                <m:t>λ</m:t>
-              </m:r>
-              <m:r>
-                <m:rPr>
-                  <m:sty m:val="p"/>
-                </m:rPr>
-                <m:t>=</m:t>
-              </m:r>
-              <m:r>
-                <m:t>1</m:t>
-              </m:r>
-            </m:oMath>
-          </w:p>
-        </w:tc>
-        <w:tc>
-          <w:tcPr/>
-          <w:p>
-            <w:pPr>
-              <w:pStyle w:val="Compact"/>
-            </w:pPr>
-            <w:r>
-              <w:t xml:space="preserve">Target episode encoding</w:t>
-            </w:r>
-          </w:p>
-        </w:tc>
-      </w:tr>
-      <w:tr>
-        <w:tc>
-          <w:tcPr/>
-          <w:p>
-            <w:pPr>
-              <w:pStyle w:val="Compact"/>
-            </w:pPr>
-            <w:r>
-              <w:t xml:space="preserve">Break</w:t>
-            </w:r>
-          </w:p>
-        </w:tc>
-        <w:tc>
-          <w:tcPr/>
-          <w:p>
-            <w:pPr>
-              <w:pStyle w:val="Compact"/>
-            </w:pPr>
-            <w:r>
-              <w:t xml:space="preserve">Encode break items</w:t>
-            </w:r>
-          </w:p>
-        </w:tc>
-        <w:tc>
-          <w:tcPr/>
-          <w:p>
-            <w:pPr>
-              <w:pStyle w:val="Compact"/>
-            </w:pPr>
-            <m:oMath>
-              <m:r>
-                <m:t>β</m:t>
-              </m:r>
-              <m:r>
-                <m:rPr>
-                  <m:sty m:val="p"/>
-                </m:rPr>
-                <m:t>=</m:t>
-              </m:r>
-              <m:sSubSup>
-                <m:e>
-                  <m:r>
-                    <m:t>m</m:t>
-                  </m:r>
-                </m:e>
-                <m:sub>
-                  <m:r>
-                    <m:rPr>
-                      <m:nor/>
-                      <m:sty m:val="p"/>
-                    </m:rPr>
-                    <m:t>break</m:t>
-                  </m:r>
-                </m:sub>
-                <m:sup>
-                  <m:r>
-                    <m:t>β</m:t>
-                  </m:r>
-                </m:sup>
-              </m:sSubSup>
-              <m:sSub>
-                <m:e>
-                  <m:r>
-                    <m:t>β</m:t>
-                  </m:r>
-                </m:e>
-                <m:sub>
-                  <m:r>
-                    <m:t>e</m:t>
-                  </m:r>
-                  <m:r>
-                    <m:t>n</m:t>
-                  </m:r>
-                  <m:r>
-                    <m:t>c</m:t>
-                  </m:r>
-                </m:sub>
-              </m:sSub>
-            </m:oMath>
-            <w:r>
-              <w:t xml:space="preserve">;</w:t>
-            </w:r>
-            <w:r>
-              <w:t xml:space="preserve"> </w:t>
-            </w:r>
-            <m:oMath>
-              <m:r>
-                <m:t>λ</m:t>
-              </m:r>
-              <m:r>
-                <m:rPr>
-                  <m:sty m:val="p"/>
-                </m:rPr>
-                <m:t>=</m:t>
-              </m:r>
-              <m:sSubSup>
-                <m:e>
-                  <m:r>
-                    <m:t>m</m:t>
-                  </m:r>
-                </m:e>
-                <m:sub>
-                  <m:r>
-                    <m:rPr>
-                      <m:nor/>
-                      <m:sty m:val="p"/>
-                    </m:rPr>
-                    <m:t>break</m:t>
-                  </m:r>
-                </m:sub>
-                <m:sup>
-                  <m:r>
-                    <m:t>λ</m:t>
-                  </m:r>
-                </m:sup>
-              </m:sSubSup>
-            </m:oMath>
-          </w:p>
-        </w:tc>
-        <w:tc>
-          <w:tcPr/>
-          <w:p>
-            <w:pPr>
-              <w:pStyle w:val="Compact"/>
-            </w:pPr>
-            <w:r>
-              <w:t xml:space="preserve">Delay and possible break-item competitors</w:t>
-            </w:r>
-          </w:p>
-        </w:tc>
-      </w:tr>
-      <w:tr>
-        <w:tc>
-          <w:tcPr/>
-          <w:p>
-            <w:pPr>
-              <w:pStyle w:val="Compact"/>
-            </w:pPr>
-            <w:r>
-              <w:t xml:space="preserve">Reminder start</w:t>
-            </w:r>
-          </w:p>
-        </w:tc>
-        <w:tc>
-          <w:tcPr/>
-          <w:p>
-            <w:pPr>
-              <w:pStyle w:val="Compact"/>
-            </w:pPr>
-            <w:r>
-              <w:t xml:space="preserve">Drift toward start state</w:t>
-            </w:r>
-          </w:p>
-        </w:tc>
-        <w:tc>
-          <w:tcPr/>
-          <w:p>
-            <w:pPr>
-              <w:pStyle w:val="Compact"/>
-            </w:pPr>
-            <m:oMath>
-              <m:r>
-                <m:t>β</m:t>
-              </m:r>
-              <m:r>
-                <m:rPr>
-                  <m:sty m:val="p"/>
-                </m:rPr>
-                <m:t>=</m:t>
-              </m:r>
-              <m:sSubSup>
-                <m:e>
-                  <m:r>
-                    <m:t>m</m:t>
-                  </m:r>
-                </m:e>
-                <m:sub>
-                  <m:r>
-                    <m:rPr>
-                      <m:nor/>
-                      <m:sty m:val="p"/>
-                    </m:rPr>
-                    <m:t>rem,start</m:t>
-                  </m:r>
-                </m:sub>
-                <m:sup>
-                  <m:r>
-                    <m:t>β</m:t>
-                  </m:r>
-                </m:sup>
-              </m:sSubSup>
-              <m:sSub>
-                <m:e>
-                  <m:r>
-                    <m:t>β</m:t>
-                  </m:r>
-                </m:e>
-                <m:sub>
-                  <m:r>
-                    <m:t>s</m:t>
-                  </m:r>
-                  <m:r>
-                    <m:t>t</m:t>
-                  </m:r>
-                  <m:r>
-                    <m:t>a</m:t>
-                  </m:r>
-                  <m:r>
-                    <m:t>r</m:t>
-                  </m:r>
-                  <m:r>
-                    <m:t>t</m:t>
-                  </m:r>
-                </m:sub>
-              </m:sSub>
-            </m:oMath>
-            <w:r>
-              <w:t xml:space="preserve">; no learning</w:t>
-            </w:r>
-          </w:p>
-        </w:tc>
-        <w:tc>
-          <w:tcPr/>
-          <w:p>
-            <w:pPr>
-              <w:pStyle w:val="Compact"/>
-            </w:pPr>
-            <w:r>
-              <w:t xml:space="preserve">Context change before reminders</w:t>
-            </w:r>
-          </w:p>
-        </w:tc>
-      </w:tr>
-      <w:tr>
-        <w:tc>
-          <w:tcPr/>
-          <w:p>
-            <w:pPr>
-              <w:pStyle w:val="Compact"/>
-            </w:pPr>
-            <w:r>
-              <w:t xml:space="preserve">Film reminder</w:t>
-            </w:r>
-          </w:p>
-        </w:tc>
-        <w:tc>
-          <w:tcPr/>
-          <w:p>
-            <w:pPr>
-              <w:pStyle w:val="Compact"/>
-            </w:pPr>
-            <w:r>
-              <w:t xml:space="preserve">Sequentially cue film items</w:t>
-            </w:r>
-          </w:p>
-        </w:tc>
-        <w:tc>
-          <w:tcPr/>
-          <w:p>
-            <w:pPr>
-              <w:pStyle w:val="Compact"/>
-            </w:pPr>
-            <m:oMath>
-              <m:r>
-                <m:t>β</m:t>
-              </m:r>
-              <m:r>
-                <m:rPr>
-                  <m:sty m:val="p"/>
-                </m:rPr>
-                <m:t>=</m:t>
-              </m:r>
-              <m:sSubSup>
-                <m:e>
-                  <m:r>
-                    <m:t>m</m:t>
-                  </m:r>
-                </m:e>
-                <m:sub>
-                  <m:r>
-                    <m:rPr>
-                      <m:nor/>
-                      <m:sty m:val="p"/>
-                    </m:rPr>
-                    <m:t>rem</m:t>
-                  </m:r>
-                </m:sub>
-                <m:sup>
-                  <m:r>
-                    <m:t>β</m:t>
-                  </m:r>
-                </m:sup>
-              </m:sSubSup>
-              <m:sSub>
-                <m:e>
-                  <m:r>
-                    <m:t>β</m:t>
-                  </m:r>
-                </m:e>
-                <m:sub>
-                  <m:r>
-                    <m:t>e</m:t>
-                  </m:r>
-                  <m:r>
-                    <m:t>n</m:t>
-                  </m:r>
-                  <m:r>
-                    <m:t>c</m:t>
-                  </m:r>
-                </m:sub>
-              </m:sSub>
-            </m:oMath>
-            <w:r>
-              <w:t xml:space="preserve">; no learning; no new recallable item</w:t>
-            </w:r>
-          </w:p>
-        </w:tc>
-        <w:tc>
-          <w:tcPr/>
-          <w:p>
-            <w:pPr>
-              <w:pStyle w:val="Compact"/>
-            </w:pPr>
-            <w:r>
-              <w:t xml:space="preserve">Film-context reinstatement before task encoding</w:t>
-            </w:r>
-          </w:p>
-        </w:tc>
-      </w:tr>
-      <w:tr>
-        <w:tc>
-          <w:tcPr/>
-          <w:p>
-            <w:pPr>
-              <w:pStyle w:val="Compact"/>
-            </w:pPr>
-            <w:r>
-              <w:t xml:space="preserve">Task</w:t>
-            </w:r>
-          </w:p>
-        </w:tc>
-        <w:tc>
-          <w:tcPr/>
-          <w:p>
-            <w:pPr>
-              <w:pStyle w:val="Compact"/>
-            </w:pPr>
-            <w:r>
-              <w:t xml:space="preserve">Encode task items</w:t>
-            </w:r>
-          </w:p>
-        </w:tc>
-        <w:tc>
-          <w:tcPr/>
-          <w:p>
-            <w:pPr>
-              <w:pStyle w:val="Compact"/>
-            </w:pPr>
-            <m:oMath>
-              <m:r>
-                <m:t>β</m:t>
-              </m:r>
-              <m:r>
-                <m:rPr>
-                  <m:sty m:val="p"/>
-                </m:rPr>
-                <m:t>=</m:t>
-              </m:r>
-              <m:sSubSup>
-                <m:e>
-                  <m:r>
-                    <m:t>m</m:t>
-                  </m:r>
-                </m:e>
-                <m:sub>
-                  <m:r>
-                    <m:rPr>
-                      <m:nor/>
-                      <m:sty m:val="p"/>
-                    </m:rPr>
-                    <m:t>task</m:t>
-                  </m:r>
-                </m:sub>
-                <m:sup>
-                  <m:r>
-                    <m:t>β</m:t>
-                  </m:r>
-                </m:sup>
-              </m:sSubSup>
-              <m:sSub>
-                <m:e>
-                  <m:r>
-                    <m:t>β</m:t>
-                  </m:r>
-                </m:e>
-                <m:sub>
-                  <m:r>
-                    <m:t>e</m:t>
-                  </m:r>
-                  <m:r>
-                    <m:t>n</m:t>
-                  </m:r>
-                  <m:r>
-                    <m:t>c</m:t>
-                  </m:r>
-                </m:sub>
-              </m:sSub>
-            </m:oMath>
-            <w:r>
-              <w:t xml:space="preserve">;</w:t>
-            </w:r>
-            <w:r>
-              <w:t xml:space="preserve"> </w:t>
-            </w:r>
-            <m:oMath>
-              <m:r>
-                <m:t>λ</m:t>
-              </m:r>
-              <m:r>
-                <m:rPr>
-                  <m:sty m:val="p"/>
-                </m:rPr>
-                <m:t>=</m:t>
-              </m:r>
-              <m:sSubSup>
-                <m:e>
-                  <m:r>
-                    <m:t>m</m:t>
-                  </m:r>
-                </m:e>
-                <m:sub>
-                  <m:r>
-                    <m:rPr>
-                      <m:nor/>
-                      <m:sty m:val="p"/>
-                    </m:rPr>
-                    <m:t>task</m:t>
-                  </m:r>
-                </m:sub>
-                <m:sup>
-                  <m:r>
-                    <m:t>λ</m:t>
-                  </m:r>
-                </m:sup>
-              </m:sSubSup>
-            </m:oMath>
-          </w:p>
-        </w:tc>
-        <w:tc>
-          <w:tcPr/>
-          <w:p>
-            <w:pPr>
-              <w:pStyle w:val="Compact"/>
-            </w:pPr>
-            <w:r>
-              <w:t xml:space="preserve">Competitor encoding and film-task contextual overlap</w:t>
-            </w:r>
-          </w:p>
-        </w:tc>
-      </w:tr>
-      <w:tr>
-        <w:tc>
-          <w:tcPr/>
-          <w:p>
-            <w:pPr>
-              <w:pStyle w:val="Compact"/>
-            </w:pPr>
-            <w:r>
-              <w:t xml:space="preserve">Filler</w:t>
-            </w:r>
-          </w:p>
-        </w:tc>
-        <w:tc>
-          <w:tcPr/>
-          <w:p>
-            <w:pPr>
-              <w:pStyle w:val="Compact"/>
-            </w:pPr>
-            <w:r>
-              <w:t xml:space="preserve">Encode filler items</w:t>
-            </w:r>
-          </w:p>
-        </w:tc>
-        <w:tc>
-          <w:tcPr/>
-          <w:p>
-            <w:pPr>
-              <w:pStyle w:val="Compact"/>
-            </w:pPr>
-            <m:oMath>
-              <m:r>
-                <m:t>β</m:t>
-              </m:r>
-              <m:r>
-                <m:rPr>
-                  <m:sty m:val="p"/>
-                </m:rPr>
-                <m:t>=</m:t>
-              </m:r>
-              <m:sSubSup>
-                <m:e>
-                  <m:r>
-                    <m:t>m</m:t>
-                  </m:r>
-                </m:e>
-                <m:sub>
-                  <m:r>
-                    <m:rPr>
-                      <m:nor/>
-                      <m:sty m:val="p"/>
-                    </m:rPr>
-                    <m:t>fill</m:t>
-                  </m:r>
-                </m:sub>
-                <m:sup>
-                  <m:r>
-                    <m:t>β</m:t>
-                  </m:r>
-                </m:sup>
-              </m:sSubSup>
-              <m:sSub>
-                <m:e>
-                  <m:r>
-                    <m:t>β</m:t>
-                  </m:r>
-                </m:e>
-                <m:sub>
-                  <m:r>
-                    <m:t>e</m:t>
-                  </m:r>
-                  <m:r>
-                    <m:t>n</m:t>
-                  </m:r>
-                  <m:r>
-                    <m:t>c</m:t>
-                  </m:r>
-                </m:sub>
-              </m:sSub>
-            </m:oMath>
-            <w:r>
-              <w:t xml:space="preserve">;</w:t>
-            </w:r>
-            <w:r>
-              <w:t xml:space="preserve"> </w:t>
-            </w:r>
-            <m:oMath>
-              <m:r>
-                <m:t>λ</m:t>
-              </m:r>
-              <m:r>
-                <m:rPr>
-                  <m:sty m:val="p"/>
-                </m:rPr>
-                <m:t>=</m:t>
-              </m:r>
-              <m:sSubSup>
-                <m:e>
-                  <m:r>
-                    <m:t>m</m:t>
-                  </m:r>
-                </m:e>
-                <m:sub>
-                  <m:r>
-                    <m:rPr>
-                      <m:nor/>
-                      <m:sty m:val="p"/>
-                    </m:rPr>
-                    <m:t>fill</m:t>
-                  </m:r>
-                </m:sub>
-                <m:sup>
-                  <m:r>
-                    <m:t>λ</m:t>
-                  </m:r>
-                </m:sup>
-              </m:sSubSup>
-            </m:oMath>
-          </w:p>
-        </w:tc>
-        <w:tc>
-          <w:tcPr/>
-          <w:p>
-            <w:pPr>
-              <w:pStyle w:val="Compact"/>
-            </w:pPr>
-            <w:r>
-              <w:t xml:space="preserve">Post-task buffer and possible filler competitors</w:t>
-            </w:r>
-          </w:p>
-        </w:tc>
-      </w:tr>
-      <w:tr>
-        <w:tc>
-          <w:tcPr/>
-          <w:p>
-            <w:pPr>
-              <w:pStyle w:val="Compact"/>
-            </w:pPr>
-            <w:r>
-              <w:t xml:space="preserve">Unguided retrieval</w:t>
-            </w:r>
-          </w:p>
-        </w:tc>
-        <w:tc>
-          <w:tcPr/>
-          <w:p>
-            <w:pPr>
-              <w:pStyle w:val="Compact"/>
-            </w:pPr>
-            <w:r>
-              <w:t xml:space="preserve">Context-to-feature retrieval</w:t>
-            </w:r>
-          </w:p>
-        </w:tc>
-        <w:tc>
-          <w:tcPr/>
-          <w:p>
-            <w:pPr>
-              <w:pStyle w:val="Compact"/>
-            </w:pPr>
-            <w:r>
-              <w:t xml:space="preserve">Current context; baseline</w:t>
-            </w:r>
-            <w:r>
-              <w:t xml:space="preserve"> </w:t>
-            </w:r>
-            <m:oMath>
-              <m:r>
-                <m:t>τ</m:t>
-              </m:r>
-            </m:oMath>
-            <w:r>
-              <w:t xml:space="preserve">; no film-directed start cue</w:t>
-            </w:r>
-          </w:p>
-        </w:tc>
-        <w:tc>
-          <w:tcPr/>
-          <w:p>
-            <w:pPr>
-              <w:pStyle w:val="Compact"/>
-            </w:pPr>
-            <w:r>
-              <w:t xml:space="preserve">Broad retrieval from the current context state</w:t>
-            </w:r>
-          </w:p>
-        </w:tc>
-      </w:tr>
-      <w:tr>
-        <w:tc>
-          <w:tcPr/>
-          <w:p>
-            <w:pPr>
-              <w:pStyle w:val="Compact"/>
-            </w:pPr>
-            <w:r>
-              <w:t xml:space="preserve">Deliberate recall</w:t>
-            </w:r>
-          </w:p>
-        </w:tc>
-        <w:tc>
-          <w:tcPr/>
-          <w:p>
-            <w:pPr>
-              <w:pStyle w:val="Compact"/>
-            </w:pPr>
-            <w:r>
-              <w:t xml:space="preserve">Context-to-feature retrieval with control</w:t>
-            </w:r>
-          </w:p>
-        </w:tc>
-        <w:tc>
-          <w:tcPr/>
-          <w:p>
-            <w:pPr>
-              <w:pStyle w:val="Compact"/>
-            </w:pPr>
-            <w:r>
-              <w:t xml:space="preserve">Film-directed start/context cueing; scaled</w:t>
-            </w:r>
-            <w:r>
-              <w:t xml:space="preserve"> </w:t>
-            </w:r>
-            <m:oMath>
-              <m:r>
-                <m:t>τ</m:t>
-              </m:r>
-            </m:oMath>
-            <w:r>
-              <w:t xml:space="preserve">; target monitoring when enabled</w:t>
-            </w:r>
-          </w:p>
-        </w:tc>
-        <w:tc>
-          <w:tcPr/>
-          <w:p>
-            <w:pPr>
-              <w:pStyle w:val="Compact"/>
-            </w:pPr>
-            <w:r>
-              <w:t xml:space="preserve">Voluntary film-directed retrieval</w:t>
-            </w:r>
-          </w:p>
-        </w:tc>
-      </w:tr>
-    </w:tbl>
-    <w:bookmarkEnd w:id="46"/>
-    <w:p>
-      <w:pPr>
-        <w:pStyle w:val="AfterWithoutNote"/>
-      </w:pPr>
-      <w:r>
-        <w:t xml:space="preserve">The reminder phase applies the film-item reminder cue operation sequentially to the film items.</w:t>
-      </w:r>
-      <w:r>
-        <w:t xml:space="preserve"> </w:t>
-      </w:r>
-      <w:r>
-        <w:t xml:space="preserve">Each reminder cue uses</w:t>
-      </w:r>
-      <w:r>
-        <w:t xml:space="preserve"> </w:t>
-      </w:r>
-      <w:hyperlink w:anchor="eq-context-input">
-        <w:r>
-          <w:rPr>
-            <w:rStyle w:val="Hyperlink"/>
-          </w:rPr>
-          <w:t xml:space="preserve">Equation 3</w:t>
-        </w:r>
-      </w:hyperlink>
-      <w:r>
-        <w:t xml:space="preserve"> </w:t>
-      </w:r>
-      <w:r>
-        <w:t xml:space="preserve">and</w:t>
-      </w:r>
-      <w:r>
-        <w:t xml:space="preserve"> </w:t>
-      </w:r>
-      <w:hyperlink w:anchor="eq-context-update">
-        <w:r>
-          <w:rPr>
-            <w:rStyle w:val="Hyperlink"/>
-          </w:rPr>
-          <w:t xml:space="preserve">Equation 4</w:t>
-        </w:r>
-      </w:hyperlink>
-      <w:r>
-        <w:t xml:space="preserve"> </w:t>
-      </w:r>
-      <w:r>
-        <w:t xml:space="preserve">to reinstate context, but it does not apply</w:t>
-      </w:r>
-      <w:r>
-        <w:t xml:space="preserve"> </w:t>
-      </w:r>
-      <w:hyperlink w:anchor="eq-mfc-learning">
-        <w:r>
-          <w:rPr>
-            <w:rStyle w:val="Hyperlink"/>
-          </w:rPr>
-          <w:t xml:space="preserve">Equation 6</w:t>
-        </w:r>
-      </w:hyperlink>
-      <w:r>
-        <w:t xml:space="preserve"> </w:t>
-      </w:r>
-      <w:r>
-        <w:t xml:space="preserve">or</w:t>
-      </w:r>
-      <w:r>
-        <w:t xml:space="preserve"> </w:t>
-      </w:r>
-      <w:hyperlink w:anchor="eq-mcf-learning">
-        <w:r>
-          <w:rPr>
-            <w:rStyle w:val="Hyperlink"/>
-          </w:rPr>
-          <w:t xml:space="preserve">Equation 8</w:t>
-        </w:r>
-      </w:hyperlink>
-      <w:r>
-        <w:t xml:space="preserve"> </w:t>
-      </w:r>
-      <w:r>
-        <w:t xml:space="preserve">and is not added as a recallable item.</w:t>
-      </w:r>
-      <w:r>
-        <w:t xml:space="preserve"> </w:t>
-      </w:r>
-      <w:r>
-        <w:t xml:space="preserve">Task items encoded after stronger reminder reinstatement are therefore associated with context states more similar to those associated with film items.</w:t>
-      </w:r>
-      <w:r>
-        <w:t xml:space="preserve"> </w:t>
-      </w:r>
-      <w:r>
-        <w:t xml:space="preserve">Increasing</w:t>
-      </w:r>
-      <w:r>
-        <w:t xml:space="preserve"> </w:t>
-      </w:r>
-      <m:oMath>
-        <m:sSubSup>
-          <m:e>
-            <m:r>
-              <m:t>m</m:t>
-            </m:r>
-          </m:e>
-          <m:sub>
-            <m:r>
-              <m:rPr>
-                <m:nor/>
-                <m:sty m:val="p"/>
-              </m:rPr>
-              <m:t>task</m:t>
-            </m:r>
-          </m:sub>
-          <m:sup>
-            <m:r>
-              <m:t>λ</m:t>
-            </m:r>
-          </m:sup>
-        </m:sSubSup>
-      </m:oMath>
-      <w:r>
-        <w:t xml:space="preserve"> </w:t>
-      </w:r>
-      <w:r>
-        <w:t xml:space="preserve">scales</w:t>
-      </w:r>
-      <w:r>
-        <w:t xml:space="preserve"> </w:t>
-      </w:r>
-      <w:hyperlink w:anchor="eq-mcf-learning">
-        <w:r>
-          <w:rPr>
-            <w:rStyle w:val="Hyperlink"/>
-          </w:rPr>
-          <w:t xml:space="preserve">Equation 8</w:t>
-        </w:r>
-      </w:hyperlink>
-      <w:r>
-        <w:t xml:space="preserve"> </w:t>
-      </w:r>
-      <w:r>
-        <w:t xml:space="preserve">and makes task items stronger competitors once cued, whereas changing</w:t>
-      </w:r>
-      <w:r>
-        <w:t xml:space="preserve"> </w:t>
-      </w:r>
-      <m:oMath>
-        <m:sSubSup>
-          <m:e>
-            <m:r>
-              <m:t>m</m:t>
-            </m:r>
-          </m:e>
-          <m:sub>
-            <m:r>
-              <m:rPr>
-                <m:nor/>
-                <m:sty m:val="p"/>
-              </m:rPr>
-              <m:t>task</m:t>
-            </m:r>
-          </m:sub>
-          <m:sup>
-            <m:r>
-              <m:t>β</m:t>
-            </m:r>
-          </m:sup>
-        </m:sSubSup>
-      </m:oMath>
-      <w:r>
-        <w:t xml:space="preserve"> </w:t>
-      </w:r>
-      <w:r>
-        <w:t xml:space="preserve">changes the drift term in</w:t>
-      </w:r>
-      <w:r>
-        <w:t xml:space="preserve"> </w:t>
-      </w:r>
-      <w:hyperlink w:anchor="eq-context-update">
-        <w:r>
-          <w:rPr>
-            <w:rStyle w:val="Hyperlink"/>
-          </w:rPr>
-          <w:t xml:space="preserve">Equation 4</w:t>
-        </w:r>
-      </w:hyperlink>
-      <w:r>
-        <w:t xml:space="preserve"> </w:t>
-      </w:r>
-      <w:r>
-        <w:t xml:space="preserve">and how close task-associated context remains to film-associated context.</w:t>
-      </w:r>
-      <w:r>
-        <w:t xml:space="preserve"> </w:t>
-      </w:r>
-      <w:r>
-        <w:t xml:space="preserve">Together, task drift and task learning determine whether the task phase is merely added experience or a source of items that are both contextually recruited and strong competitors.</w:t>
-      </w:r>
-    </w:p>
-    <w:bookmarkEnd w:id="47"/>
-    <w:bookmarkStart w:id="51" w:name="retrieval-control"/>
+    <w:bookmarkStart w:id="49" w:name="retrieval-control"/>
     <w:p>
       <w:pPr>
         <w:pStyle w:val="Heading2"/>
@@ -6910,7 +5735,7 @@
       <w:pPr>
         <w:pStyle w:val="BodyText"/>
       </w:pPr>
-      <w:bookmarkStart w:id="48" w:name="eq-deliberate-start-cue"/>
+      <w:bookmarkStart w:id="46" w:name="eq-deliberate-start-cue"/>
       <m:oMathPara>
         <m:oMathParaPr>
           <m:jc m:val="center"/>
@@ -7032,7 +5857,7 @@
           </m:d>
         </m:oMath>
       </m:oMathPara>
-      <w:bookmarkEnd w:id="48"/>
+      <w:bookmarkEnd w:id="46"/>
     </w:p>
     <w:p>
       <w:pPr>
@@ -7315,7 +6140,7 @@
       <w:pPr>
         <w:pStyle w:val="BodyText"/>
       </w:pPr>
-      <w:bookmarkStart w:id="49" w:name="eq-target-monitoring-update"/>
+      <w:bookmarkStart w:id="47" w:name="eq-target-monitoring-update"/>
       <m:oMathPara>
         <m:oMathParaPr>
           <m:jc m:val="center"/>
@@ -7490,7 +6315,7 @@
           </m:d>
         </m:oMath>
       </m:oMathPara>
-      <w:bookmarkEnd w:id="49"/>
+      <w:bookmarkEnd w:id="47"/>
     </w:p>
     <w:p>
       <w:pPr>
@@ -7550,7 +6375,7 @@
       <w:pPr>
         <w:pStyle w:val="BodyText"/>
       </w:pPr>
-      <w:bookmarkStart w:id="50" w:name="eq-film-cue-input"/>
+      <w:bookmarkStart w:id="48" w:name="eq-film-cue-input"/>
       <m:oMathPara>
         <m:oMathParaPr>
           <m:jc m:val="center"/>
@@ -7641,7 +6466,7 @@
           </m:d>
         </m:oMath>
       </m:oMathPara>
-      <w:bookmarkEnd w:id="50"/>
+      <w:bookmarkEnd w:id="48"/>
     </w:p>
     <w:p>
       <w:pPr>
@@ -7651,8 +6476,8 @@
         <w:t xml:space="preserve">This cue is not a separate retrieval system; it is the same feature-to-context operation applied to a supplied film item.</w:t>
       </w:r>
     </w:p>
-    <w:bookmarkEnd w:id="51"/>
-    <w:bookmarkStart w:id="55" w:name="affective-context"/>
+    <w:bookmarkEnd w:id="49"/>
+    <w:bookmarkStart w:id="53" w:name="affective-context"/>
     <w:p>
       <w:pPr>
         <w:pStyle w:val="Heading2"/>
@@ -7666,7 +6491,47 @@
         <w:pStyle w:val="FirstParagraph"/>
       </w:pPr>
       <w:r>
-        <w:t xml:space="preserve">The model also includes affective context components inherited from eCMR.</w:t>
+        <w:t xml:space="preserve">The model also includes an affective-context pathway inherited from eCMR</w:t>
+      </w:r>
+      <w:r>
+        <w:t xml:space="preserve"> </w:t>
+      </w:r>
+      <w:r>
+        <w:t xml:space="preserve">(</w:t>
+      </w:r>
+      <w:hyperlink w:anchor="ref-cohen2022memory">
+        <w:r>
+          <w:rPr>
+            <w:rStyle w:val="Hyperlink"/>
+          </w:rPr>
+          <w:t xml:space="preserve">Cohen &amp; Kahana, 2022</w:t>
+        </w:r>
+      </w:hyperlink>
+      <w:r>
+        <w:t xml:space="preserve">;</w:t>
+      </w:r>
+      <w:r>
+        <w:t xml:space="preserve"> </w:t>
+      </w:r>
+      <w:hyperlink w:anchor="ref-talmi2019retrieved">
+        <w:r>
+          <w:rPr>
+            <w:rStyle w:val="Hyperlink"/>
+          </w:rPr>
+          <w:t xml:space="preserve">Talmi et al., 2019</w:t>
+        </w:r>
+      </w:hyperlink>
+      <w:r>
+        <w:t xml:space="preserve">)</w:t>
+      </w:r>
+      <w:r>
+        <w:t xml:space="preserve">.</w:t>
+      </w:r>
+      <w:r>
+        <w:t xml:space="preserve"> </w:t>
+      </w:r>
+      <w:r>
+        <w:t xml:space="preserve">The affective pathway tests whether shared affective state can amplify competition; it does not make task affect the explanation of selective interference.</w:t>
       </w:r>
       <w:r>
         <w:t xml:space="preserve"> </w:t>
@@ -7853,18 +6718,32 @@
         <w:t xml:space="preserve"> </w:t>
       </w:r>
       <w:r>
-        <w:t xml:space="preserve">It initializes affective rows of</w:t>
+        <w:t xml:space="preserve">The affective feature vector initializes</w:t>
       </w:r>
       <w:r>
         <w:t xml:space="preserve"> </w:t>
       </w:r>
       <m:oMath>
-        <m:sSup>
+        <m:sSubSup>
           <m:e>
             <m:r>
               <m:t>M</m:t>
             </m:r>
           </m:e>
+          <m:sub>
+            <m:r>
+              <m:t>e</m:t>
+            </m:r>
+            <m:r>
+              <m:t>m</m:t>
+            </m:r>
+            <m:r>
+              <m:t>o</m:t>
+            </m:r>
+            <m:r>
+              <m:t>t</m:t>
+            </m:r>
+          </m:sub>
           <m:sup>
             <m:r>
               <m:t>F</m:t>
@@ -7873,7 +6752,7 @@
               <m:t>C</m:t>
             </m:r>
           </m:sup>
-        </m:sSup>
+        </m:sSubSup>
       </m:oMath>
       <w:r>
         <w:t xml:space="preserve"> </w:t>
@@ -7886,7 +6765,7 @@
       <w:pPr>
         <w:pStyle w:val="BodyText"/>
       </w:pPr>
-      <w:bookmarkStart w:id="52" w:name="eq-aff-mfc-pre"/>
+      <w:bookmarkStart w:id="50" w:name="eq-emot-mfc-pre"/>
       <m:oMathPara>
         <m:oMathParaPr>
           <m:jc m:val="center"/>
@@ -7900,13 +6779,16 @@
             </m:e>
             <m:sub>
               <m:r>
-                <m:t>a</m:t>
-              </m:r>
-              <m:r>
-                <m:t>f</m:t>
-              </m:r>
-              <m:r>
-                <m:t>f</m:t>
+                <m:t>e</m:t>
+              </m:r>
+              <m:r>
+                <m:t>m</m:t>
+              </m:r>
+              <m:r>
+                <m:t>o</m:t>
+              </m:r>
+              <m:r>
+                <m:t>t</m:t>
               </m:r>
             </m:sub>
             <m:sup>
@@ -8001,7 +6883,7 @@
           </m:d>
         </m:oMath>
       </m:oMathPara>
-      <w:bookmarkEnd w:id="52"/>
+      <w:bookmarkEnd w:id="50"/>
     </w:p>
     <w:p>
       <w:pPr>
@@ -8015,7 +6897,7 @@
       <w:pPr>
         <w:pStyle w:val="BodyText"/>
       </w:pPr>
-      <w:bookmarkStart w:id="53" w:name="eq-aff-mcf-pre"/>
+      <w:bookmarkStart w:id="51" w:name="eq-emot-mcf-pre"/>
       <m:oMathPara>
         <m:oMathParaPr>
           <m:jc m:val="center"/>
@@ -8029,13 +6911,16 @@
             </m:e>
             <m:sub>
               <m:r>
-                <m:t>a</m:t>
-              </m:r>
-              <m:r>
-                <m:t>f</m:t>
-              </m:r>
-              <m:r>
-                <m:t>f</m:t>
+                <m:t>e</m:t>
+              </m:r>
+              <m:r>
+                <m:t>m</m:t>
+              </m:r>
+              <m:r>
+                <m:t>o</m:t>
+              </m:r>
+              <m:r>
+                <m:t>t</m:t>
               </m:r>
             </m:sub>
             <m:sup>
@@ -8099,7 +6984,7 @@
           </m:d>
         </m:oMath>
       </m:oMathPara>
-      <w:bookmarkEnd w:id="53"/>
+      <w:bookmarkEnd w:id="51"/>
     </w:p>
     <w:p>
       <w:pPr>
@@ -8362,7 +7247,7 @@
       <w:pPr>
         <w:pStyle w:val="BodyText"/>
       </w:pPr>
-      <w:bookmarkStart w:id="54" w:name="eq-aff-mcf-learning"/>
+      <w:bookmarkStart w:id="52" w:name="eq-emot-mcf-learning"/>
       <m:oMathPara>
         <m:oMathParaPr>
           <m:jc m:val="center"/>
@@ -8379,13 +7264,16 @@
             </m:e>
             <m:sub>
               <m:r>
-                <m:t>a</m:t>
-              </m:r>
-              <m:r>
-                <m:t>f</m:t>
-              </m:r>
-              <m:r>
-                <m:t>f</m:t>
+                <m:t>e</m:t>
+              </m:r>
+              <m:r>
+                <m:t>m</m:t>
+              </m:r>
+              <m:r>
+                <m:t>o</m:t>
+              </m:r>
+              <m:r>
+                <m:t>t</m:t>
               </m:r>
             </m:sub>
             <m:sup>
@@ -8483,19 +7371,25 @@
                 <m:rPr>
                   <m:sty m:val="p"/>
                 </m:rPr>
-                <m:t>a</m:t>
+                <m:t>e</m:t>
               </m:r>
               <m:r>
                 <m:rPr>
                   <m:sty m:val="p"/>
                 </m:rPr>
-                <m:t>f</m:t>
+                <m:t>m</m:t>
               </m:r>
               <m:r>
                 <m:rPr>
                   <m:sty m:val="p"/>
                 </m:rPr>
-                <m:t>f</m:t>
+                <m:t>o</m:t>
+              </m:r>
+              <m:r>
+                <m:rPr>
+                  <m:sty m:val="p"/>
+                </m:rPr>
+                <m:t>t</m:t>
               </m:r>
               <m:r>
                 <m:rPr>
@@ -8534,7 +7428,7 @@
           </m:d>
         </m:oMath>
       </m:oMathPara>
-      <w:bookmarkEnd w:id="54"/>
+      <w:bookmarkEnd w:id="52"/>
     </w:p>
     <w:p>
       <w:pPr>
@@ -8558,19 +7452,25 @@
               <m:rPr>
                 <m:sty m:val="p"/>
               </m:rPr>
-              <m:t>a</m:t>
+              <m:t>e</m:t>
             </m:r>
             <m:r>
               <m:rPr>
                 <m:sty m:val="p"/>
               </m:rPr>
-              <m:t>f</m:t>
+              <m:t>m</m:t>
             </m:r>
             <m:r>
               <m:rPr>
                 <m:sty m:val="p"/>
               </m:rPr>
-              <m:t>f</m:t>
+              <m:t>o</m:t>
+            </m:r>
+            <m:r>
+              <m:rPr>
+                <m:sty m:val="p"/>
+              </m:rPr>
+              <m:t>t</m:t>
             </m:r>
             <m:r>
               <m:rPr>
@@ -8600,12 +7500,38 @@
         <w:t xml:space="preserve"> </w:t>
       </w:r>
       <w:r>
+        <w:t xml:space="preserve">When learned affective support is present, it contributes to the same context-to-feature competition defined in</w:t>
+      </w:r>
+      <w:r>
+        <w:t xml:space="preserve"> </w:t>
+      </w:r>
+      <w:hyperlink w:anchor="eq-retrieval-support">
+        <w:r>
+          <w:rPr>
+            <w:rStyle w:val="Hyperlink"/>
+          </w:rPr>
+          <w:t xml:space="preserve">Equation 9</w:t>
+        </w:r>
+      </w:hyperlink>
+      <w:r>
+        <w:t xml:space="preserve">.</w:t>
+      </w:r>
+      <w:r>
+        <w:t xml:space="preserve"> </w:t>
+      </w:r>
+      <w:r>
+        <w:t xml:space="preserve">Task items are distinct item features and are assigned the marked affective feature only in affective-overlap variants.</w:t>
+      </w:r>
+      <w:r>
+        <w:t xml:space="preserve"> </w:t>
+      </w:r>
+      <w:r>
         <w:t xml:space="preserve">When film and task items share the marked affective feature and affective context-to-feature learning is enabled,</w:t>
       </w:r>
       <w:r>
         <w:t xml:space="preserve"> </w:t>
       </w:r>
-      <w:hyperlink w:anchor="eq-aff-mcf-learning">
+      <w:hyperlink w:anchor="eq-emot-mcf-learning">
         <w:r>
           <w:rPr>
             <w:rStyle w:val="Hyperlink"/>
@@ -8625,7 +7551,7 @@
         <w:pStyle w:val="BodyText"/>
       </w:pPr>
       <w:r>
-        <w:t xml:space="preserve">The simulations below vary the phase, reminder, retrieval-control, and affective settings described above while keeping the underlying item-context architecture fixed.</w:t>
+        <w:t xml:space="preserve">These equations define the item-context architecture used in all simulations.</w:t>
       </w:r>
       <w:r>
         <w:t xml:space="preserve"> </w:t>
@@ -8634,15 +7560,455 @@
         <w:t xml:space="preserve">Because retrieval proceeds as a sequence of competitive samples terminated by a growing stop probability, task competitors can reduce film retrieval by winning individual retrieval competitions before search terminates.</w:t>
       </w:r>
     </w:p>
+    <w:bookmarkEnd w:id="53"/>
+    <w:bookmarkEnd w:id="54"/>
+    <w:bookmarkStart w:id="67" w:name="simulations"/>
+    <w:p>
+      <w:pPr>
+        <w:pStyle w:val="Heading1"/>
+      </w:pPr>
+      <w:r>
+        <w:t xml:space="preserve">Simulations</w:t>
+      </w:r>
+    </w:p>
+    <w:p>
+      <w:pPr>
+        <w:pStyle w:val="FirstParagraph"/>
+      </w:pPr>
+      <w:r>
+        <w:t xml:space="preserve">The simulations configure the model specification above rather than adding new mechanisms.</w:t>
+      </w:r>
+      <w:r>
+        <w:t xml:space="preserve"> </w:t>
+      </w:r>
+      <w:r>
+        <w:t xml:space="preserve">They use the same CMR operations to encode target film items, intervening non-film items, task items, and post-task filler items, and they use the same retrieval rule for unguided retrieval and deliberate recall.</w:t>
+      </w:r>
+      <w:r>
+        <w:t xml:space="preserve"> </w:t>
+      </w:r>
+      <w:r>
+        <w:t xml:space="preserve">The design is organized around empirical contrasts in clip content, post-clip task, and retrieval mode, with immediate and delayed/post-reminder timing variants.</w:t>
+      </w:r>
+    </w:p>
+    <w:bookmarkStart w:id="55" w:name="tbl-simulated-design"/>
+    <w:p>
+      <w:pPr>
+        <w:pStyle w:val="FigureTitle"/>
+      </w:pPr>
+      <w:r>
+        <w:t xml:space="preserve">Table 2</w:t>
+      </w:r>
+    </w:p>
+    <w:p>
+      <w:pPr>
+        <w:pStyle w:val="Caption"/>
+      </w:pPr>
+      <w:r>
+        <w:t xml:space="preserve">Simulated design components and their model implementation.</w:t>
+      </w:r>
+      <w:r>
+        <w:t xml:space="preserve"> </w:t>
+      </w:r>
+      <w:r>
+        <w:t xml:space="preserve">The table maps empirical contrasts onto model operations rather than listing all phase-specific parameter values.</w:t>
+      </w:r>
+    </w:p>
+    <w:tbl>
+      <w:tblPr>
+        <w:tblStyle w:val="Table"/>
+        <w:tblW w:type="pct" w:w="5000"/>
+        <w:tblLayout w:type="fixed"/>
+        <w:tblLook w:firstRow="1" w:lastRow="0" w:firstColumn="0" w:lastColumn="0" w:noHBand="0" w:noVBand="0" w:val="0020"/>
+      </w:tblPr>
+      <w:tblGrid>
+        <w:gridCol w:w="2640"/>
+        <w:gridCol w:w="2640"/>
+        <w:gridCol w:w="2640"/>
+      </w:tblGrid>
+      <w:tr>
+        <w:trPr>
+          <w:tblHeader w:val="on"/>
+        </w:trPr>
+        <w:tc>
+          <w:tcPr/>
+          <w:p>
+            <w:pPr>
+              <w:pStyle w:val="Compact"/>
+            </w:pPr>
+            <w:r>
+              <w:t xml:space="preserve">Design component</w:t>
+            </w:r>
+          </w:p>
+        </w:tc>
+        <w:tc>
+          <w:tcPr/>
+          <w:p>
+            <w:pPr>
+              <w:pStyle w:val="Compact"/>
+            </w:pPr>
+            <w:r>
+              <w:t xml:space="preserve">Variants</w:t>
+            </w:r>
+          </w:p>
+        </w:tc>
+        <w:tc>
+          <w:tcPr/>
+          <w:p>
+            <w:pPr>
+              <w:pStyle w:val="Compact"/>
+            </w:pPr>
+            <w:r>
+              <w:t xml:space="preserve">Model role</w:t>
+            </w:r>
+          </w:p>
+        </w:tc>
+      </w:tr>
+      <w:tr>
+        <w:tc>
+          <w:tcPr/>
+          <w:p>
+            <w:pPr>
+              <w:pStyle w:val="Compact"/>
+            </w:pPr>
+            <w:r>
+              <w:t xml:space="preserve">Film/clip items</w:t>
+            </w:r>
+          </w:p>
+        </w:tc>
+        <w:tc>
+          <w:tcPr/>
+          <w:p>
+            <w:pPr>
+              <w:pStyle w:val="Compact"/>
+            </w:pPr>
+            <w:r>
+              <w:t xml:space="preserve">Trauma/affective or neutral target clips</w:t>
+            </w:r>
+          </w:p>
+        </w:tc>
+        <w:tc>
+          <w:tcPr/>
+          <w:p>
+            <w:pPr>
+              <w:pStyle w:val="Compact"/>
+            </w:pPr>
+            <w:r>
+              <w:t xml:space="preserve">Film items are the target episode whose later access is measured; affective marking is enabled only for affective-overlap variants.</w:t>
+            </w:r>
+          </w:p>
+        </w:tc>
+      </w:tr>
+      <w:tr>
+        <w:tc>
+          <w:tcPr/>
+          <w:p>
+            <w:pPr>
+              <w:pStyle w:val="Compact"/>
+            </w:pPr>
+            <w:r>
+              <w:t xml:space="preserve">Task condition</w:t>
+            </w:r>
+          </w:p>
+        </w:tc>
+        <w:tc>
+          <w:tcPr/>
+          <w:p>
+            <w:pPr>
+              <w:pStyle w:val="Compact"/>
+            </w:pPr>
+            <w:r>
+              <w:t xml:space="preserve">Visuospatial interference task or comparison task</w:t>
+            </w:r>
+          </w:p>
+        </w:tc>
+        <w:tc>
+          <w:tcPr/>
+          <w:p>
+            <w:pPr>
+              <w:pStyle w:val="Compact"/>
+            </w:pPr>
+            <w:r>
+              <w:t xml:space="preserve">Task items are potential competitors encoded after film encoding or reminder reinstatement; task learning strength indexes how strongly they compete once cued.</w:t>
+            </w:r>
+          </w:p>
+        </w:tc>
+      </w:tr>
+      <w:tr>
+        <w:tc>
+          <w:tcPr/>
+          <w:p>
+            <w:pPr>
+              <w:pStyle w:val="Compact"/>
+            </w:pPr>
+            <w:r>
+              <w:t xml:space="preserve">Affective overlap</w:t>
+            </w:r>
+          </w:p>
+        </w:tc>
+        <w:tc>
+          <w:tcPr/>
+          <w:p>
+            <w:pPr>
+              <w:pStyle w:val="Compact"/>
+            </w:pPr>
+            <w:r>
+              <w:t xml:space="preserve">Film-only marking or shared film-task marking</w:t>
+            </w:r>
+          </w:p>
+        </w:tc>
+        <w:tc>
+          <w:tcPr/>
+          <w:p>
+            <w:pPr>
+              <w:pStyle w:val="Compact"/>
+            </w:pPr>
+            <w:r>
+              <w:t xml:space="preserve">Tests whether shared affective state amplifies task competition.</w:t>
+            </w:r>
+          </w:p>
+        </w:tc>
+      </w:tr>
+      <w:tr>
+        <w:tc>
+          <w:tcPr/>
+          <w:p>
+            <w:pPr>
+              <w:pStyle w:val="Compact"/>
+            </w:pPr>
+            <w:r>
+              <w:t xml:space="preserve">Timing/reinstatement</w:t>
+            </w:r>
+          </w:p>
+        </w:tc>
+        <w:tc>
+          <w:tcPr/>
+          <w:p>
+            <w:pPr>
+              <w:pStyle w:val="Compact"/>
+            </w:pPr>
+            <w:r>
+              <w:t xml:space="preserve">Immediate post-film task or delayed post-reminder task</w:t>
+            </w:r>
+          </w:p>
+        </w:tc>
+        <w:tc>
+          <w:tcPr/>
+          <w:p>
+            <w:pPr>
+              <w:pStyle w:val="Compact"/>
+            </w:pPr>
+            <w:r>
+              <w:t xml:space="preserve">Tests whether delayed reminders increase overlap by reinstating film-associated context before task encoding.</w:t>
+            </w:r>
+          </w:p>
+        </w:tc>
+      </w:tr>
+      <w:tr>
+        <w:tc>
+          <w:tcPr/>
+          <w:p>
+            <w:pPr>
+              <w:pStyle w:val="Compact"/>
+            </w:pPr>
+            <w:r>
+              <w:t xml:space="preserve">Buffer/filler experience</w:t>
+            </w:r>
+          </w:p>
+        </w:tc>
+        <w:tc>
+          <w:tcPr/>
+          <w:p>
+            <w:pPr>
+              <w:pStyle w:val="Compact"/>
+            </w:pPr>
+            <w:r>
+              <w:t xml:space="preserve">Pre-reminder buffer and post-task filler</w:t>
+            </w:r>
+          </w:p>
+        </w:tc>
+        <w:tc>
+          <w:tcPr/>
+          <w:p>
+            <w:pPr>
+              <w:pStyle w:val="Compact"/>
+            </w:pPr>
+            <w:r>
+              <w:t xml:space="preserve">Moves context away from film and adds non-film items that can enter retrieval competition.</w:t>
+            </w:r>
+          </w:p>
+        </w:tc>
+      </w:tr>
+      <w:tr>
+        <w:tc>
+          <w:tcPr/>
+          <w:p>
+            <w:pPr>
+              <w:pStyle w:val="Compact"/>
+            </w:pPr>
+            <w:r>
+              <w:t xml:space="preserve">Retrieval mode</w:t>
+            </w:r>
+          </w:p>
+        </w:tc>
+        <w:tc>
+          <w:tcPr/>
+          <w:p>
+            <w:pPr>
+              <w:pStyle w:val="Compact"/>
+            </w:pPr>
+            <w:r>
+              <w:t xml:space="preserve">Unguided retrieval or deliberate recall</w:t>
+            </w:r>
+          </w:p>
+        </w:tc>
+        <w:tc>
+          <w:tcPr/>
+          <w:p>
+            <w:pPr>
+              <w:pStyle w:val="Compact"/>
+            </w:pPr>
+            <w:r>
+              <w:t xml:space="preserve">Tests whether film-directed control protects voluntary access within the same retrieval architecture.</w:t>
+            </w:r>
+          </w:p>
+        </w:tc>
+      </w:tr>
+    </w:tbl>
     <w:bookmarkEnd w:id="55"/>
-    <w:bookmarkEnd w:id="56"/>
-    <w:bookmarkStart w:id="67" w:name="simulations"/>
-    <w:p>
-      <w:pPr>
-        <w:pStyle w:val="Heading1"/>
-      </w:pPr>
-      <w:r>
-        <w:t xml:space="preserve">Simulations</w:t>
+    <w:p>
+      <w:pPr>
+        <w:pStyle w:val="AfterWithoutNote"/>
+      </w:pPr>
+      <w:r>
+        <w:t xml:space="preserve">Delayed/post-reminder simulations implement the reminder as two context-updating operations.</w:t>
+      </w:r>
+      <w:r>
+        <w:t xml:space="preserve"> </w:t>
+      </w:r>
+      <w:r>
+        <w:t xml:space="preserve">After the pre-reminder buffer, context first drifts toward the start state.</w:t>
+      </w:r>
+      <w:r>
+        <w:t xml:space="preserve"> </w:t>
+      </w:r>
+      <w:r>
+        <w:t xml:space="preserve">The model then applies film-item reminder cues sequentially, using</w:t>
+      </w:r>
+      <w:r>
+        <w:t xml:space="preserve"> </w:t>
+      </w:r>
+      <w:hyperlink w:anchor="eq-context-input">
+        <w:r>
+          <w:rPr>
+            <w:rStyle w:val="Hyperlink"/>
+          </w:rPr>
+          <w:t xml:space="preserve">Equation 3</w:t>
+        </w:r>
+      </w:hyperlink>
+      <w:r>
+        <w:t xml:space="preserve"> </w:t>
+      </w:r>
+      <w:r>
+        <w:t xml:space="preserve">and</w:t>
+      </w:r>
+      <w:r>
+        <w:t xml:space="preserve"> </w:t>
+      </w:r>
+      <w:hyperlink w:anchor="eq-context-update">
+        <w:r>
+          <w:rPr>
+            <w:rStyle w:val="Hyperlink"/>
+          </w:rPr>
+          <w:t xml:space="preserve">Equation 4</w:t>
+        </w:r>
+      </w:hyperlink>
+      <w:r>
+        <w:t xml:space="preserve"> </w:t>
+      </w:r>
+      <w:r>
+        <w:t xml:space="preserve">with a reminder-cue drift rate lower than encoding drift in the working simulations.</w:t>
+      </w:r>
+      <w:r>
+        <w:t xml:space="preserve"> </w:t>
+      </w:r>
+      <w:r>
+        <w:t xml:space="preserve">This lower drift rate represents the assumption that brief reminder images provide weaker contextual evidence than full film-item presentations.</w:t>
+      </w:r>
+      <w:r>
+        <w:t xml:space="preserve"> </w:t>
+      </w:r>
+      <w:r>
+        <w:t xml:space="preserve">Reminder cues do not apply</w:t>
+      </w:r>
+      <w:r>
+        <w:t xml:space="preserve"> </w:t>
+      </w:r>
+      <w:hyperlink w:anchor="eq-mfc-learning">
+        <w:r>
+          <w:rPr>
+            <w:rStyle w:val="Hyperlink"/>
+          </w:rPr>
+          <w:t xml:space="preserve">Equation 6</w:t>
+        </w:r>
+      </w:hyperlink>
+      <w:r>
+        <w:t xml:space="preserve"> </w:t>
+      </w:r>
+      <w:r>
+        <w:t xml:space="preserve">or</w:t>
+      </w:r>
+      <w:r>
+        <w:t xml:space="preserve"> </w:t>
+      </w:r>
+      <w:hyperlink w:anchor="eq-mcf-learning">
+        <w:r>
+          <w:rPr>
+            <w:rStyle w:val="Hyperlink"/>
+          </w:rPr>
+          <w:t xml:space="preserve">Equation 8</w:t>
+        </w:r>
+      </w:hyperlink>
+      <w:r>
+        <w:t xml:space="preserve"> </w:t>
+      </w:r>
+      <w:r>
+        <w:t xml:space="preserve">and do not add new recallable items.</w:t>
+      </w:r>
+      <w:r>
+        <w:t xml:space="preserve"> </w:t>
+      </w:r>
+      <w:r>
+        <w:t xml:space="preserve">The immediate variant omits the structured pre-reminder buffer and reminder operations, placing the task phase directly after film encoding.</w:t>
+      </w:r>
+    </w:p>
+    <w:p>
+      <w:pPr>
+        <w:pStyle w:val="BodyText"/>
+      </w:pPr>
+      <w:r>
+        <w:t xml:space="preserve">Phase-specific parameter settings are introduced where the simulations vary them.</w:t>
+      </w:r>
+      <w:r>
+        <w:t xml:space="preserve"> </w:t>
+      </w:r>
+      <w:r>
+        <w:t xml:space="preserve">Task-learning settings index competitor strength, drift and reminder settings index contextual overlap, retrieval-control settings distinguish unguided retrieval from deliberate recall, and affective marking tests shared-state amplification.</w:t>
+      </w:r>
+      <w:r>
+        <w:t xml:space="preserve"> </w:t>
+      </w:r>
+      <w:r>
+        <w:t xml:space="preserve">Fixed settings for buffer and filler phases are treated as simulation configuration rather than as additional model mechanisms.</w:t>
+      </w:r>
+    </w:p>
+    <w:bookmarkStart w:id="60" w:name="current-diagnostic-sweep"/>
+    <w:p>
+      <w:pPr>
+        <w:pStyle w:val="Heading2"/>
+      </w:pPr>
+      <w:r>
+        <w:t xml:space="preserve">Current Diagnostic Sweep</w:t>
       </w:r>
     </w:p>
     <w:p>
@@ -8662,16 +8028,10 @@
         <w:t xml:space="preserve"> </w:t>
       </w:r>
       <w:r>
-        <w:t xml:space="preserve">The section scaffold below records what each simulation must establish before the final result text is written.</w:t>
-      </w:r>
-      <w:r>
-        <w:t xml:space="preserve"> </w:t>
-      </w:r>
-      <w:r>
-        <w:t xml:space="preserve">Each subsection specifies the core contrast, the primary readouts, and the main design decision still open at this stage.</w:t>
-      </w:r>
-    </w:p>
-    <w:bookmarkStart w:id="60" w:name="fig-interference-sweep-spc"/>
+        <w:t xml:space="preserve">This figure will move into the relevant simulation section once the final simulation package is fixed.</w:t>
+      </w:r>
+    </w:p>
+    <w:bookmarkStart w:id="59" w:name="fig-interference-sweep-spc"/>
     <w:p>
       <w:pPr>
         <w:pStyle w:val="FigureTitle"/>
@@ -8715,18 +8075,18 @@
           <wp:inline>
             <wp:extent cx="5943600" cy="2214422"/>
             <wp:effectExtent b="0" l="0" r="0" t="0"/>
-            <wp:docPr descr="" title="" id="58" name="Picture"/>
+            <wp:docPr descr="" title="" id="57" name="Picture"/>
             <a:graphic>
               <a:graphicData uri="http://schemas.openxmlformats.org/drawingml/2006/picture">
                 <pic:pic>
                   <pic:nvPicPr>
-                    <pic:cNvPr descr="figures/interference_mcf_scale_delay16_fit_no_shared_support_side_by_side_spc.png" id="59" name="Picture"/>
+                    <pic:cNvPr descr="figures/interference_mcf_scale_delay16_fit_no_shared_support_side_by_side_spc.png" id="58" name="Picture"/>
                     <pic:cNvPicPr>
                       <a:picLocks noChangeArrowheads="1" noChangeAspect="1"/>
                     </pic:cNvPicPr>
                   </pic:nvPicPr>
                   <pic:blipFill>
-                    <a:blip r:embed="rId57"/>
+                    <a:blip r:embed="rId56"/>
                     <a:stretch>
                       <a:fillRect/>
                     </a:stretch>
@@ -8751,6 +8111,21 @@
             </a:graphic>
           </wp:inline>
         </w:drawing>
+      </w:r>
+    </w:p>
+    <w:bookmarkEnd w:id="59"/>
+    <w:p>
+      <w:pPr>
+        <w:pStyle w:val="AfterWithoutNote"/>
+      </w:pPr>
+      <w:r>
+        <w:t xml:space="preserve">The section scaffold below records what each simulation must establish before the final result text is written.</w:t>
+      </w:r>
+      <w:r>
+        <w:t xml:space="preserve"> </w:t>
+      </w:r>
+      <w:r>
+        <w:t xml:space="preserve">Each subsection specifies the core contrast, the primary readouts, and the main design decision still open at this stage.</w:t>
       </w:r>
     </w:p>
     <w:bookmarkEnd w:id="60"/>

</xml_diff>